<commit_message>
se agrego experiencia laboral
</commit_message>
<xml_diff>
--- a/src/assets/PlantillaDos.docx
+++ b/src/assets/PlantillaDos.docx
@@ -312,6 +312,161 @@
           <w:docGrid w:linePitch="360"/>
         </w:sectPr>
       </w:pPr>
+    </w:p>
+    <w:p>
+      <w:pPr>
+        <w:spacing w:before="360" w:after="60"/>
+        <w:rPr>
+          <w:b/>
+          <w:bCs/>
+          <w:color w:val="0070C0"/>
+          <w:lang w:val="es-ES"/>
+        </w:rPr>
+      </w:pPr>
+      <w:r>
+        <w:rPr>
+          <w:b/>
+          <w:bCs/>
+          <w:color w:val="0070C0"/>
+          <w:lang w:val="es-ES"/>
+        </w:rPr>
+        <w:t>EXPERIENCIA LABORAL</w:t>
+      </w:r>
+    </w:p>
+    <w:p>
+      <w:pPr>
+        <w:spacing w:after="120" w:line="240" w:lineRule="auto"/>
+      </w:pPr>
+      <w:r>
+        <w:t>{#experiencias}</w:t>
+      </w:r>
+    </w:p>
+    <w:p>
+      <w:pPr>
+        <w:tabs>
+          <w:tab w:val="left" w:pos="7027"/>
+        </w:tabs>
+        <w:spacing w:after="120" w:line="240" w:lineRule="auto"/>
+        <w:rPr>
+          <w:b/>
+          <w:bCs/>
+        </w:rPr>
+      </w:pPr>
+      <w:r>
+        <w:rPr>
+          <w:b/>
+          <w:bCs/>
+        </w:rPr>
+        <w:t>{puesto} - {empresa}</w:t>
+      </w:r>
+    </w:p>
+    <w:p>
+      <w:pPr>
+        <w:tabs>
+          <w:tab w:val="left" w:pos="7027"/>
+        </w:tabs>
+        <w:spacing w:after="120" w:line="240" w:lineRule="auto"/>
+        <w:rPr>
+          <w:b/>
+          <w:bCs/>
+        </w:rPr>
+      </w:pPr>
+      <w:r>
+        <w:t>{periodo}</w:t>
+      </w:r>
+    </w:p>
+    <w:p>
+      <w:pPr>
+        <w:spacing w:after="120" w:line="240" w:lineRule="auto"/>
+      </w:pPr>
+      <w:r>
+        <w:t>{</w:t>
+      </w:r>
+      <w:proofErr w:type="spellStart"/>
+      <w:r>
+        <w:t>descripcion</w:t>
+      </w:r>
+      <w:proofErr w:type="spellEnd"/>
+      <w:r>
+        <w:t>}</w:t>
+      </w:r>
+    </w:p>
+    <w:p>
+      <w:pPr>
+        <w:spacing w:after="120" w:line="240" w:lineRule="auto"/>
+      </w:pPr>
+      <w:r>
+        <w:t>{/experiencias}</w:t>
+      </w:r>
+    </w:p>
+    <w:p>
+      <w:pPr>
+        <w:spacing w:after="120" w:line="240" w:lineRule="auto"/>
+      </w:pPr>
+      <w:r>
+        <w:rPr>
+          <w:noProof/>
+          <w:lang w:val="es-ES"/>
+        </w:rPr>
+        <mc:AlternateContent>
+          <mc:Choice Requires="wps">
+            <w:drawing>
+              <wp:inline distT="0" distB="0" distL="0" distR="0" wp14:anchorId="0D6A8B0B" wp14:editId="1AD0950E">
+                <wp:extent cx="2987675" cy="0"/>
+                <wp:effectExtent l="0" t="0" r="0" b="0"/>
+                <wp:docPr id="1" name="Conector recto 1"/>
+                <wp:cNvGraphicFramePr/>
+                <a:graphic xmlns:a="http://schemas.openxmlformats.org/drawingml/2006/main">
+                  <a:graphicData uri="http://schemas.microsoft.com/office/word/2010/wordprocessingShape">
+                    <wps:wsp>
+                      <wps:cNvCnPr/>
+                      <wps:spPr>
+                        <a:xfrm>
+                          <a:off x="0" y="0"/>
+                          <a:ext cx="2987675" cy="0"/>
+                        </a:xfrm>
+                        <a:prstGeom prst="line">
+                          <a:avLst/>
+                        </a:prstGeom>
+                        <a:ln w="19050">
+                          <a:solidFill>
+                            <a:schemeClr val="bg2">
+                              <a:lumMod val="75000"/>
+                            </a:schemeClr>
+                          </a:solidFill>
+                        </a:ln>
+                      </wps:spPr>
+                      <wps:style>
+                        <a:lnRef idx="1">
+                          <a:schemeClr val="accent1"/>
+                        </a:lnRef>
+                        <a:fillRef idx="0">
+                          <a:schemeClr val="accent1"/>
+                        </a:fillRef>
+                        <a:effectRef idx="0">
+                          <a:schemeClr val="accent1"/>
+                        </a:effectRef>
+                        <a:fontRef idx="minor">
+                          <a:schemeClr val="tx1"/>
+                        </a:fontRef>
+                      </wps:style>
+                      <wps:bodyPr/>
+                    </wps:wsp>
+                  </a:graphicData>
+                </a:graphic>
+              </wp:inline>
+            </w:drawing>
+          </mc:Choice>
+          <mc:Fallback>
+            <w:pict>
+              <v:line w14:anchorId="6ACB160D" id="Conector recto 1" o:spid="_x0000_s1026" style="visibility:visible;mso-wrap-style:square;mso-left-percent:-10001;mso-top-percent:-10001;mso-position-horizontal:absolute;mso-position-horizontal-relative:char;mso-position-vertical:absolute;mso-position-vertical-relative:line;mso-left-percent:-10001;mso-top-percent:-10001" from="0,0" to="235.25pt,0" o:gfxdata="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" strokecolor="#adadad [2414]" strokeweight="1.5pt">
+                <v:stroke joinstyle="miter"/>
+                <w10:anchorlock/>
+              </v:line>
+            </w:pict>
+          </mc:Fallback>
+        </mc:AlternateContent>
+      </w:r>
     </w:p>
     <w:p>
       <w:pPr>

</xml_diff>

<commit_message>
se agrego formato dos columna
</commit_message>
<xml_diff>
--- a/src/assets/PlantillaDos.docx
+++ b/src/assets/PlantillaDos.docx
@@ -1,6 +1,6 @@
 
 <file path=word/document.xml><?xml version="1.0" encoding="utf-8"?>
-<w:document xmlns:wpc="http://schemas.microsoft.com/office/word/2010/wordprocessingCanvas" xmlns:cx="http://schemas.microsoft.com/office/drawing/2014/chartex" xmlns:cx1="http://schemas.microsoft.com/office/drawing/2015/9/8/chartex" xmlns:cx2="http://schemas.microsoft.com/office/drawing/2015/10/21/chartex" xmlns:cx3="http://schemas.microsoft.com/office/drawing/2016/5/9/chartex" xmlns:cx4="http://schemas.microsoft.com/office/drawing/2016/5/10/chartex" xmlns:cx5="http://schemas.microsoft.com/office/drawing/2016/5/11/chartex" xmlns:cx6="http://schemas.microsoft.com/office/drawing/2016/5/12/chartex" xmlns:cx7="http://schemas.microsoft.com/office/drawing/2016/5/13/chartex" xmlns:cx8="http://schemas.microsoft.com/office/drawing/2016/5/14/chartex" xmlns:mc="http://schemas.openxmlformats.org/markup-compatibility/2006" xmlns:aink="http://schemas.microsoft.com/office/drawing/2016/ink" xmlns:am3d="http://schemas.microsoft.com/office/drawing/2017/model3d" xmlns:o="urn:schemas-microsoft-com:office:office" xmlns:oel="http://schemas.microsoft.com/office/2019/extlst" xmlns:r="http://schemas.openxmlformats.org/officeDocument/2006/relationships" xmlns:m="http://schemas.openxmlformats.org/officeDocument/2006/math" xmlns:v="urn:schemas-microsoft-com:vml" xmlns:wp14="http://schemas.microsoft.com/office/word/2010/wordprocessingDrawing" xmlns:wp="http://schemas.openxmlformats.org/drawingml/2006/wordprocessingDrawing" xmlns:w10="urn:schemas-microsoft-com:office:word" xmlns:w="http://schemas.openxmlformats.org/wordprocessingml/2006/main" xmlns:w14="http://schemas.microsoft.com/office/word/2010/wordml" xmlns:w15="http://schemas.microsoft.com/office/word/2012/wordml" xmlns:w16cex="http://schemas.microsoft.com/office/word/2018/wordml/cex" xmlns:w16cid="http://schemas.microsoft.com/office/word/2016/wordml/cid" xmlns:w16="http://schemas.microsoft.com/office/word/2018/wordml" xmlns:w16sdtdh="http://schemas.microsoft.com/office/word/2020/wordml/sdtdatahash" xmlns:w16se="http://schemas.microsoft.com/office/word/2015/wordml/symex" xmlns:wpg="http://schemas.microsoft.com/office/word/2010/wordprocessingGroup" xmlns:wpi="http://schemas.microsoft.com/office/word/2010/wordprocessingInk" xmlns:wne="http://schemas.microsoft.com/office/word/2006/wordml" xmlns:wps="http://schemas.microsoft.com/office/word/2010/wordprocessingShape" mc:Ignorable="w14 w15 w16se w16cid w16 w16cex w16sdtdh wp14">
+<w:document xmlns:wpc="http://schemas.microsoft.com/office/word/2010/wordprocessingCanvas" xmlns:cx="http://schemas.microsoft.com/office/drawing/2014/chartex" xmlns:cx1="http://schemas.microsoft.com/office/drawing/2015/9/8/chartex" xmlns:mc="http://schemas.openxmlformats.org/markup-compatibility/2006" xmlns:o="urn:schemas-microsoft-com:office:office" xmlns:r="http://schemas.openxmlformats.org/officeDocument/2006/relationships" xmlns:m="http://schemas.openxmlformats.org/officeDocument/2006/math" xmlns:v="urn:schemas-microsoft-com:vml" xmlns:wp14="http://schemas.microsoft.com/office/word/2010/wordprocessingDrawing" xmlns:wp="http://schemas.openxmlformats.org/drawingml/2006/wordprocessingDrawing" xmlns:w10="urn:schemas-microsoft-com:office:word" xmlns:w="http://schemas.openxmlformats.org/wordprocessingml/2006/main" xmlns:w14="http://schemas.microsoft.com/office/word/2010/wordml" xmlns:w15="http://schemas.microsoft.com/office/word/2012/wordml" xmlns:w16se="http://schemas.microsoft.com/office/word/2015/wordml/symex" xmlns:wpg="http://schemas.microsoft.com/office/word/2010/wordprocessingGroup" xmlns:wpi="http://schemas.microsoft.com/office/word/2010/wordprocessingInk" xmlns:wne="http://schemas.microsoft.com/office/word/2006/wordml" xmlns:wps="http://schemas.microsoft.com/office/word/2010/wordprocessingShape" mc:Ignorable="w14 w15 w16se wp14">
   <w:body>
     <w:p>
       <w:pPr>
@@ -15,7 +15,7 @@
         <w:rPr>
           <w:noProof/>
           <w:color w:val="45B0E1" w:themeColor="accent1" w:themeTint="99"/>
-          <w:lang w:val="es-ES"/>
+          <w:lang w:eastAsia="es-MX"/>
         </w:rPr>
         <w:drawing>
           <wp:anchor distT="0" distB="0" distL="0" distR="0" simplePos="0" relativeHeight="251659264" behindDoc="0" locked="0" layoutInCell="1" allowOverlap="1" wp14:anchorId="7288FE42" wp14:editId="0C8F102F">
@@ -106,191 +106,397 @@
     </w:p>
     <w:p>
       <w:pPr>
-        <w:spacing w:after="120" w:line="240" w:lineRule="auto"/>
+        <w:spacing w:after="0"/>
+        <w:jc w:val="both"/>
         <w:rPr>
           <w:b/>
           <w:bCs/>
-        </w:rPr>
-      </w:pPr>
-      <w:r>
-        <w:rPr>
+          <w:lang w:val="es-ES"/>
+        </w:rPr>
+      </w:pPr>
+      <w:r>
+        <w:rPr>
+          <w:rFonts w:ascii="Palatino Linotype" w:hAnsi="Palatino Linotype" w:cs="Calibri"/>
           <w:b/>
           <w:bCs/>
+          <w:sz w:val="28"/>
+          <w:szCs w:val="28"/>
         </w:rPr>
         <w:t>{</w:t>
       </w:r>
       <w:proofErr w:type="spellStart"/>
       <w:r>
         <w:rPr>
+          <w:rFonts w:ascii="Palatino Linotype" w:hAnsi="Palatino Linotype" w:cs="Calibri"/>
           <w:b/>
           <w:bCs/>
+          <w:sz w:val="28"/>
+          <w:szCs w:val="28"/>
         </w:rPr>
         <w:t>EtNom</w:t>
       </w:r>
       <w:proofErr w:type="spellEnd"/>
       <w:r>
         <w:rPr>
+          <w:rFonts w:ascii="Palatino Linotype" w:hAnsi="Palatino Linotype" w:cs="Calibri"/>
           <w:b/>
           <w:bCs/>
+          <w:sz w:val="28"/>
+          <w:szCs w:val="28"/>
         </w:rPr>
         <w:t>}</w:t>
       </w:r>
     </w:p>
     <w:p>
       <w:pPr>
-        <w:spacing w:after="120" w:line="240" w:lineRule="auto"/>
-      </w:pPr>
-      <w:r>
-        <w:t>Edad: {</w:t>
+        <w:spacing w:after="0"/>
+        <w:jc w:val="both"/>
+        <w:rPr>
+          <w:b/>
+          <w:bCs/>
+        </w:rPr>
+      </w:pPr>
+      <w:r>
+        <w:rPr>
+          <w:rFonts w:ascii="Palatino Linotype" w:hAnsi="Palatino Linotype" w:cs="Calibri"/>
+          <w:sz w:val="22"/>
+          <w:szCs w:val="22"/>
+          <w:lang w:val="es-ES"/>
+        </w:rPr>
+        <w:t>Años de experiencia</w:t>
+      </w:r>
+      <w:r>
+        <w:rPr>
+          <w:lang w:val="es-ES"/>
+        </w:rPr>
+        <w:t xml:space="preserve"> </w:t>
+      </w:r>
+      <w:r>
+        <w:rPr>
+          <w:rFonts w:ascii="Palatino Linotype" w:hAnsi="Palatino Linotype" w:cs="Calibri"/>
+          <w:sz w:val="22"/>
+          <w:szCs w:val="22"/>
+          <w:lang w:val="es-ES"/>
+        </w:rPr>
+        <w:t>profesional</w:t>
+      </w:r>
+      <w:r>
+        <w:rPr>
+          <w:lang w:val="es-ES"/>
+        </w:rPr>
+        <w:t>:</w:t>
+      </w:r>
+      <w:r>
+        <w:rPr>
+          <w:rFonts w:ascii="Palatino Linotype" w:hAnsi="Palatino Linotype" w:cs="Calibri"/>
+          <w:b/>
+          <w:sz w:val="22"/>
+          <w:szCs w:val="22"/>
+          <w:lang w:val="es-ES"/>
+        </w:rPr>
+        <w:t xml:space="preserve"> {</w:t>
       </w:r>
       <w:proofErr w:type="spellStart"/>
       <w:r>
+        <w:rPr>
+          <w:rFonts w:ascii="Palatino Linotype" w:hAnsi="Palatino Linotype" w:cs="Calibri"/>
+          <w:b/>
+          <w:sz w:val="22"/>
+          <w:szCs w:val="22"/>
+          <w:lang w:val="es-ES"/>
+        </w:rPr>
+        <w:t>EtTiempoExp</w:t>
+      </w:r>
+      <w:proofErr w:type="spellEnd"/>
+      <w:r>
+        <w:rPr>
+          <w:rFonts w:ascii="Palatino Linotype" w:hAnsi="Palatino Linotype" w:cs="Calibri"/>
+          <w:b/>
+          <w:sz w:val="22"/>
+          <w:szCs w:val="22"/>
+          <w:lang w:val="es-ES"/>
+        </w:rPr>
+        <w:t>}</w:t>
+      </w:r>
+    </w:p>
+    <w:p>
+      <w:pPr>
+        <w:spacing w:after="0"/>
+        <w:jc w:val="both"/>
+        <w:rPr>
+          <w:rFonts w:ascii="Palatino Linotype" w:hAnsi="Palatino Linotype" w:cs="Calibri"/>
+          <w:sz w:val="22"/>
+          <w:szCs w:val="22"/>
+          <w:lang w:val="es-ES"/>
+        </w:rPr>
+      </w:pPr>
+      <w:r>
+        <w:rPr>
+          <w:rFonts w:ascii="Palatino Linotype" w:hAnsi="Palatino Linotype" w:cs="Calibri"/>
+          <w:sz w:val="22"/>
+          <w:szCs w:val="22"/>
+          <w:lang w:val="es-ES"/>
+        </w:rPr>
+        <w:t>{#</w:t>
+      </w:r>
+      <w:proofErr w:type="spellStart"/>
+      <w:r>
+        <w:rPr>
+          <w:rFonts w:ascii="Palatino Linotype" w:hAnsi="Palatino Linotype" w:cs="Calibri"/>
+          <w:sz w:val="22"/>
+          <w:szCs w:val="22"/>
+          <w:lang w:val="es-ES"/>
+        </w:rPr>
+        <w:t>EtId</w:t>
+      </w:r>
+      <w:proofErr w:type="spellEnd"/>
+      <w:r>
+        <w:rPr>
+          <w:rFonts w:ascii="Palatino Linotype" w:hAnsi="Palatino Linotype" w:cs="Calibri"/>
+          <w:sz w:val="22"/>
+          <w:szCs w:val="22"/>
+          <w:lang w:val="es-ES"/>
+        </w:rPr>
+        <w:t>} {idioma}</w:t>
+      </w:r>
+      <w:r>
+        <w:rPr>
+          <w:rFonts w:ascii="Palatino Linotype" w:hAnsi="Palatino Linotype" w:cs="Calibri"/>
+          <w:sz w:val="22"/>
+          <w:szCs w:val="22"/>
+          <w:lang w:val="es-ES"/>
+        </w:rPr>
+        <w:t>.</w:t>
+      </w:r>
+      <w:r>
+        <w:rPr>
+          <w:rFonts w:ascii="Palatino Linotype" w:hAnsi="Palatino Linotype" w:cs="Calibri"/>
+          <w:sz w:val="22"/>
+          <w:szCs w:val="22"/>
+          <w:lang w:val="es-ES"/>
+        </w:rPr>
+        <w:t xml:space="preserve"> {/</w:t>
+      </w:r>
+      <w:proofErr w:type="spellStart"/>
+      <w:r>
+        <w:rPr>
+          <w:rFonts w:ascii="Palatino Linotype" w:hAnsi="Palatino Linotype" w:cs="Calibri"/>
+          <w:sz w:val="22"/>
+          <w:szCs w:val="22"/>
+          <w:lang w:val="es-ES"/>
+        </w:rPr>
+        <w:t>EtId</w:t>
+      </w:r>
+      <w:proofErr w:type="spellEnd"/>
+      <w:r>
+        <w:rPr>
+          <w:rFonts w:ascii="Palatino Linotype" w:hAnsi="Palatino Linotype" w:cs="Calibri"/>
+          <w:sz w:val="22"/>
+          <w:szCs w:val="22"/>
+          <w:lang w:val="es-ES"/>
+        </w:rPr>
+        <w:t>}</w:t>
+      </w:r>
+    </w:p>
+    <w:p>
+      <w:pPr>
+        <w:spacing w:after="0"/>
+        <w:jc w:val="both"/>
+        <w:rPr>
+          <w:rFonts w:ascii="Palatino Linotype" w:hAnsi="Palatino Linotype" w:cs="Calibri"/>
+          <w:sz w:val="22"/>
+          <w:szCs w:val="22"/>
+          <w:lang w:val="es-ES"/>
+        </w:rPr>
+      </w:pPr>
+      <w:r>
+        <w:rPr>
+          <w:rFonts w:ascii="Palatino Linotype" w:hAnsi="Palatino Linotype" w:cs="Calibri"/>
+          <w:sz w:val="22"/>
+          <w:szCs w:val="22"/>
+          <w:lang w:val="es-ES"/>
+        </w:rPr>
+        <w:t>{</w:t>
+      </w:r>
+      <w:proofErr w:type="spellStart"/>
+      <w:r>
+        <w:rPr>
+          <w:rFonts w:ascii="Palatino Linotype" w:hAnsi="Palatino Linotype" w:cs="Calibri"/>
+          <w:sz w:val="22"/>
+          <w:szCs w:val="22"/>
+          <w:lang w:val="es-ES"/>
+        </w:rPr>
         <w:t>EtEd</w:t>
       </w:r>
       <w:proofErr w:type="spellEnd"/>
       <w:r>
+        <w:rPr>
+          <w:rFonts w:ascii="Palatino Linotype" w:hAnsi="Palatino Linotype" w:cs="Calibri"/>
+          <w:sz w:val="22"/>
+          <w:szCs w:val="22"/>
+          <w:lang w:val="es-ES"/>
+        </w:rPr>
         <w:t>}</w:t>
       </w:r>
-    </w:p>
-    <w:p>
-      <w:pPr>
-        <w:spacing w:after="120" w:line="240" w:lineRule="auto"/>
-      </w:pPr>
-      <w:r>
-        <w:t>Años de experiencia profesional: {</w:t>
+      <w:r>
+        <w:rPr>
+          <w:rFonts w:ascii="Palatino Linotype" w:hAnsi="Palatino Linotype" w:cs="Calibri"/>
+          <w:sz w:val="22"/>
+          <w:szCs w:val="22"/>
+          <w:lang w:val="es-ES"/>
+        </w:rPr>
+        <w:t xml:space="preserve"> Años</w:t>
+      </w:r>
+      <w:r>
+        <w:rPr>
+          <w:rFonts w:ascii="Palatino Linotype" w:hAnsi="Palatino Linotype" w:cs="Calibri"/>
+          <w:sz w:val="22"/>
+          <w:szCs w:val="22"/>
+          <w:lang w:val="es-ES"/>
+        </w:rPr>
+        <w:t>, {</w:t>
       </w:r>
       <w:proofErr w:type="spellStart"/>
       <w:r>
-        <w:t>EtTiempoExp</w:t>
+        <w:rPr>
+          <w:rFonts w:ascii="Palatino Linotype" w:hAnsi="Palatino Linotype" w:cs="Calibri"/>
+          <w:sz w:val="22"/>
+          <w:szCs w:val="22"/>
+          <w:lang w:val="es-ES"/>
+        </w:rPr>
+        <w:t>EtRe</w:t>
       </w:r>
       <w:proofErr w:type="spellEnd"/>
       <w:r>
+        <w:rPr>
+          <w:rFonts w:ascii="Palatino Linotype" w:hAnsi="Palatino Linotype" w:cs="Calibri"/>
+          <w:sz w:val="22"/>
+          <w:szCs w:val="22"/>
+          <w:lang w:val="es-ES"/>
+        </w:rPr>
         <w:t>}</w:t>
       </w:r>
-    </w:p>
-    <w:p>
-      <w:pPr>
-        <w:spacing w:after="120" w:line="240" w:lineRule="auto"/>
-      </w:pPr>
-      <w:r>
-        <w:t>Nacionalidad: {</w:t>
+      <w:r>
+        <w:rPr>
+          <w:rFonts w:ascii="Palatino Linotype" w:hAnsi="Palatino Linotype" w:cs="Calibri"/>
+          <w:sz w:val="22"/>
+          <w:szCs w:val="22"/>
+          <w:lang w:val="es-ES"/>
+        </w:rPr>
+        <w:t>.</w:t>
+      </w:r>
+    </w:p>
+    <w:p>
+      <w:pPr>
+        <w:spacing w:after="0"/>
+        <w:jc w:val="both"/>
+        <w:rPr>
+          <w:b/>
+          <w:bCs/>
+          <w:lang w:val="es-ES"/>
+        </w:rPr>
+      </w:pPr>
+    </w:p>
+    <w:p>
+      <w:pPr>
+        <w:spacing w:after="0"/>
+        <w:jc w:val="both"/>
+        <w:rPr>
+          <w:rFonts w:ascii="Palatino Linotype" w:hAnsi="Palatino Linotype" w:cs="Calibri"/>
+          <w:sz w:val="22"/>
+          <w:szCs w:val="22"/>
+          <w:lang w:val="es-ES"/>
+        </w:rPr>
+      </w:pPr>
+      <w:r>
+        <w:rPr>
+          <w:rFonts w:ascii="Palatino Linotype" w:hAnsi="Palatino Linotype" w:cs="Calibri"/>
+          <w:sz w:val="22"/>
+          <w:szCs w:val="22"/>
+          <w:lang w:val="es-ES"/>
+        </w:rPr>
+        <w:t>{#</w:t>
       </w:r>
       <w:proofErr w:type="spellStart"/>
       <w:r>
-        <w:t>EtNa</w:t>
+        <w:rPr>
+          <w:rFonts w:ascii="Palatino Linotype" w:hAnsi="Palatino Linotype" w:cs="Calibri"/>
+          <w:sz w:val="22"/>
+          <w:szCs w:val="22"/>
+          <w:lang w:val="es-ES"/>
+        </w:rPr>
+        <w:t>tieneComentarios</w:t>
       </w:r>
       <w:proofErr w:type="spellEnd"/>
       <w:r>
+        <w:rPr>
+          <w:rFonts w:ascii="Palatino Linotype" w:hAnsi="Palatino Linotype" w:cs="Calibri"/>
+          <w:sz w:val="22"/>
+          <w:szCs w:val="22"/>
+          <w:lang w:val="es-ES"/>
+        </w:rPr>
         <w:t>}</w:t>
       </w:r>
     </w:p>
     <w:p>
       <w:pPr>
-        <w:spacing w:after="120" w:line="240" w:lineRule="auto"/>
-      </w:pPr>
-      <w:r>
-        <w:t>Idiomas: {#EtId} {idioma} {/</w:t>
+        <w:spacing w:after="0"/>
+        <w:jc w:val="both"/>
+        <w:rPr>
+          <w:rFonts w:ascii="Palatino Linotype" w:hAnsi="Palatino Linotype" w:cs="Calibri"/>
+          <w:sz w:val="22"/>
+          <w:szCs w:val="22"/>
+          <w:lang w:val="es-ES"/>
+        </w:rPr>
+      </w:pPr>
+      <w:r>
+        <w:rPr>
+          <w:rFonts w:ascii="Palatino Linotype" w:hAnsi="Palatino Linotype" w:cs="Calibri"/>
+          <w:sz w:val="22"/>
+          <w:szCs w:val="22"/>
+          <w:lang w:val="es-ES"/>
+        </w:rPr>
+        <w:t>{comentarios}</w:t>
+      </w:r>
+    </w:p>
+    <w:p>
+      <w:pPr>
+        <w:spacing w:after="0"/>
+        <w:jc w:val="both"/>
+        <w:rPr>
+          <w:rFonts w:ascii="Palatino Linotype" w:hAnsi="Palatino Linotype" w:cs="Calibri"/>
+          <w:sz w:val="22"/>
+          <w:szCs w:val="22"/>
+          <w:lang w:val="es-ES"/>
+        </w:rPr>
+      </w:pPr>
+      <w:r>
+        <w:rPr>
+          <w:rFonts w:ascii="Palatino Linotype" w:hAnsi="Palatino Linotype" w:cs="Calibri"/>
+          <w:sz w:val="22"/>
+          <w:szCs w:val="22"/>
+          <w:lang w:val="es-ES"/>
+        </w:rPr>
+        <w:t>{/</w:t>
       </w:r>
       <w:proofErr w:type="spellStart"/>
       <w:r>
-        <w:t>EtId</w:t>
+        <w:rPr>
+          <w:rFonts w:ascii="Palatino Linotype" w:hAnsi="Palatino Linotype" w:cs="Calibri"/>
+          <w:sz w:val="22"/>
+          <w:szCs w:val="22"/>
+          <w:lang w:val="es-ES"/>
+        </w:rPr>
+        <w:t>tieneComentarios</w:t>
       </w:r>
       <w:proofErr w:type="spellEnd"/>
       <w:r>
-        <w:t>}</w:t>
-      </w:r>
-    </w:p>
-    <w:p>
-      <w:pPr>
-        <w:spacing w:line="240" w:lineRule="auto"/>
-      </w:pPr>
-      <w:r>
-        <w:rPr>
-          <w:noProof/>
-          <w:lang w:val="es-ES"/>
-        </w:rPr>
-        <mc:AlternateContent>
-          <mc:Choice Requires="wps">
-            <w:drawing>
-              <wp:anchor distT="0" distB="0" distL="114300" distR="114300" simplePos="0" relativeHeight="251671552" behindDoc="0" locked="0" layoutInCell="1" allowOverlap="1" wp14:anchorId="6F599C1F" wp14:editId="34F076BA">
-                <wp:simplePos x="0" y="0"/>
-                <wp:positionH relativeFrom="margin">
-                  <wp:posOffset>3409950</wp:posOffset>
-                </wp:positionH>
-                <wp:positionV relativeFrom="paragraph">
-                  <wp:posOffset>264956</wp:posOffset>
-                </wp:positionV>
-                <wp:extent cx="0" cy="6773672"/>
-                <wp:effectExtent l="0" t="0" r="38100" b="27305"/>
-                <wp:wrapNone/>
-                <wp:docPr id="6" name="Conector recto 6"/>
-                <wp:cNvGraphicFramePr/>
-                <a:graphic xmlns:a="http://schemas.openxmlformats.org/drawingml/2006/main">
-                  <a:graphicData uri="http://schemas.microsoft.com/office/word/2010/wordprocessingShape">
-                    <wps:wsp>
-                      <wps:cNvCnPr/>
-                      <wps:spPr>
-                        <a:xfrm flipH="1" flipV="1">
-                          <a:off x="0" y="0"/>
-                          <a:ext cx="0" cy="6773672"/>
-                        </a:xfrm>
-                        <a:prstGeom prst="line">
-                          <a:avLst/>
-                        </a:prstGeom>
-                        <a:ln w="19050">
-                          <a:solidFill>
-                            <a:schemeClr val="bg2">
-                              <a:lumMod val="75000"/>
-                            </a:schemeClr>
-                          </a:solidFill>
-                        </a:ln>
-                      </wps:spPr>
-                      <wps:style>
-                        <a:lnRef idx="1">
-                          <a:schemeClr val="accent1"/>
-                        </a:lnRef>
-                        <a:fillRef idx="0">
-                          <a:schemeClr val="accent1"/>
-                        </a:fillRef>
-                        <a:effectRef idx="0">
-                          <a:schemeClr val="accent1"/>
-                        </a:effectRef>
-                        <a:fontRef idx="minor">
-                          <a:schemeClr val="tx1"/>
-                        </a:fontRef>
-                      </wps:style>
-                      <wps:bodyPr/>
-                    </wps:wsp>
-                  </a:graphicData>
-                </a:graphic>
-                <wp14:sizeRelH relativeFrom="margin">
-                  <wp14:pctWidth>0</wp14:pctWidth>
-                </wp14:sizeRelH>
-                <wp14:sizeRelV relativeFrom="margin">
-                  <wp14:pctHeight>0</wp14:pctHeight>
-                </wp14:sizeRelV>
-              </wp:anchor>
-            </w:drawing>
-          </mc:Choice>
-          <mc:Fallback>
-            <w:pict>
-              <v:line w14:anchorId="2BAEB79A" id="Conector recto 6" o:spid="_x0000_s1026" style="position:absolute;flip:x y;z-index:251671552;visibility:visible;mso-wrap-style:square;mso-width-percent:0;mso-height-percent:0;mso-wrap-distance-left:9pt;mso-wrap-distance-top:0;mso-wrap-distance-right:9pt;mso-wrap-distance-bottom:0;mso-position-horizontal:absolute;mso-position-horizontal-relative:margin;mso-position-vertical:absolute;mso-position-vertical-relative:text;mso-width-percent:0;mso-height-percent:0;mso-width-relative:margin;mso-height-relative:margin" from="268.5pt,20.85pt" to="268.5pt,554.2pt" o:gfxdata="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" strokecolor="#adadad [2414]" strokeweight="1.5pt">
-                <v:stroke joinstyle="miter"/>
-                <w10:wrap anchorx="margin"/>
-              </v:line>
-            </w:pict>
-          </mc:Fallback>
-        </mc:AlternateContent>
-      </w:r>
-      <w:r>
-        <w:t>Residencia actual: {</w:t>
-      </w:r>
-      <w:proofErr w:type="spellStart"/>
-      <w:r>
-        <w:t>EtRe</w:t>
-      </w:r>
-      <w:proofErr w:type="spellEnd"/>
-      <w:r>
+        <w:rPr>
+          <w:rFonts w:ascii="Palatino Linotype" w:hAnsi="Palatino Linotype" w:cs="Calibri"/>
+          <w:sz w:val="22"/>
+          <w:szCs w:val="22"/>
+          <w:lang w:val="es-ES"/>
+        </w:rPr>
         <w:t>}</w:t>
       </w:r>
     </w:p>
@@ -317,16 +523,20 @@
       <w:pPr>
         <w:spacing w:before="360" w:after="60"/>
         <w:rPr>
+          <w:rFonts w:ascii="Palatino Linotype" w:hAnsi="Palatino Linotype"/>
           <w:b/>
           <w:bCs/>
+          <w:i/>
           <w:color w:val="0070C0"/>
           <w:lang w:val="es-ES"/>
         </w:rPr>
       </w:pPr>
       <w:r>
         <w:rPr>
+          <w:rFonts w:ascii="Palatino Linotype" w:hAnsi="Palatino Linotype"/>
           <w:b/>
           <w:bCs/>
+          <w:i/>
           <w:color w:val="0070C0"/>
           <w:lang w:val="es-ES"/>
         </w:rPr>
@@ -335,78 +545,158 @@
     </w:p>
     <w:p>
       <w:pPr>
-        <w:spacing w:after="120" w:line="240" w:lineRule="auto"/>
-      </w:pPr>
-      <w:r>
+        <w:rPr>
+          <w:rFonts w:ascii="Palatino Linotype" w:hAnsi="Palatino Linotype" w:cs="Calibri"/>
+          <w:sz w:val="22"/>
+          <w:szCs w:val="22"/>
+          <w:lang w:val="es-ES"/>
+        </w:rPr>
+      </w:pPr>
+      <w:r>
+        <w:rPr>
+          <w:rFonts w:ascii="Palatino Linotype" w:hAnsi="Palatino Linotype" w:cs="Calibri"/>
+          <w:sz w:val="22"/>
+          <w:szCs w:val="22"/>
+          <w:lang w:val="es-ES"/>
+        </w:rPr>
         <w:t>{#experiencias}</w:t>
       </w:r>
     </w:p>
     <w:p>
       <w:pPr>
-        <w:tabs>
-          <w:tab w:val="left" w:pos="7027"/>
-        </w:tabs>
-        <w:spacing w:after="120" w:line="240" w:lineRule="auto"/>
-        <w:rPr>
-          <w:b/>
-          <w:bCs/>
-        </w:rPr>
-      </w:pPr>
-      <w:r>
-        <w:rPr>
-          <w:b/>
-          <w:bCs/>
-        </w:rPr>
-        <w:t>{puesto} - {empresa}</w:t>
-      </w:r>
-    </w:p>
-    <w:p>
-      <w:pPr>
-        <w:tabs>
-          <w:tab w:val="left" w:pos="7027"/>
-        </w:tabs>
-        <w:spacing w:after="120" w:line="240" w:lineRule="auto"/>
-        <w:rPr>
-          <w:b/>
-          <w:bCs/>
-        </w:rPr>
-      </w:pPr>
-      <w:r>
+        <w:spacing w:after="0"/>
+        <w:rPr>
+          <w:rFonts w:ascii="Palatino Linotype" w:hAnsi="Palatino Linotype" w:cs="Calibri"/>
+          <w:sz w:val="22"/>
+          <w:szCs w:val="22"/>
+          <w:lang w:val="es-ES"/>
+        </w:rPr>
+      </w:pPr>
+      <w:r>
+        <w:rPr>
+          <w:rFonts w:ascii="Palatino Linotype" w:hAnsi="Palatino Linotype" w:cs="Calibri"/>
+          <w:sz w:val="22"/>
+          <w:szCs w:val="22"/>
+          <w:lang w:val="es-ES"/>
+        </w:rPr>
+        <w:t>{puesto}</w:t>
+      </w:r>
+    </w:p>
+    <w:p>
+      <w:pPr>
+        <w:spacing w:after="0"/>
+        <w:rPr>
+          <w:rFonts w:ascii="Palatino Linotype" w:hAnsi="Palatino Linotype" w:cs="Calibri"/>
+          <w:sz w:val="22"/>
+          <w:szCs w:val="22"/>
+          <w:lang w:val="es-ES"/>
+        </w:rPr>
+      </w:pPr>
+      <w:r>
+        <w:rPr>
+          <w:rFonts w:ascii="Palatino Linotype" w:hAnsi="Palatino Linotype" w:cs="Calibri"/>
+          <w:sz w:val="22"/>
+          <w:szCs w:val="22"/>
+          <w:lang w:val="es-ES"/>
+        </w:rPr>
+        <w:t>{empresa}</w:t>
+      </w:r>
+    </w:p>
+    <w:p>
+      <w:pPr>
+        <w:spacing w:after="0"/>
+        <w:rPr>
+          <w:rFonts w:ascii="Palatino Linotype" w:hAnsi="Palatino Linotype" w:cs="Calibri"/>
+          <w:sz w:val="22"/>
+          <w:szCs w:val="22"/>
+          <w:lang w:val="es-ES"/>
+        </w:rPr>
+      </w:pPr>
+      <w:r>
+        <w:rPr>
+          <w:rFonts w:ascii="Palatino Linotype" w:hAnsi="Palatino Linotype" w:cs="Calibri"/>
+          <w:sz w:val="22"/>
+          <w:szCs w:val="22"/>
+          <w:lang w:val="es-ES"/>
+        </w:rPr>
         <w:t>{periodo}</w:t>
       </w:r>
     </w:p>
     <w:p>
-      <w:pPr>
-        <w:spacing w:after="120" w:line="240" w:lineRule="auto"/>
-      </w:pPr>
-      <w:r>
-        <w:t>{</w:t>
-      </w:r>
-      <w:proofErr w:type="spellStart"/>
-      <w:r>
-        <w:t>descripcion</w:t>
-      </w:r>
-      <w:proofErr w:type="spellEnd"/>
-      <w:r>
-        <w:t>}</w:t>
-      </w:r>
-    </w:p>
-    <w:p>
-      <w:pPr>
-        <w:spacing w:after="120" w:line="240" w:lineRule="auto"/>
-      </w:pPr>
-      <w:r>
+      <w:bookmarkStart w:id="0" w:name="_GoBack"/>
+      <w:bookmarkEnd w:id="0"/>
+    </w:p>
+    <w:p>
+      <w:pPr>
+        <w:spacing w:after="0"/>
+        <w:rPr>
+          <w:rFonts w:ascii="Palatino Linotype" w:hAnsi="Palatino Linotype"/>
+        </w:rPr>
+      </w:pPr>
+      <w:r>
+        <w:rPr>
+          <w:rFonts w:ascii="Palatino Linotype" w:hAnsi="Palatino Linotype"/>
+        </w:rPr>
+        <w:t>{#</w:t>
+      </w:r>
+      <w:proofErr w:type="gramStart"/>
+      <w:r>
+        <w:rPr>
+          <w:rFonts w:ascii="Palatino Linotype" w:hAnsi="Palatino Linotype"/>
+        </w:rPr>
+        <w:t>descripciones}•</w:t>
+      </w:r>
+      <w:proofErr w:type="gramEnd"/>
+      <w:r>
+        <w:rPr>
+          <w:rFonts w:ascii="Palatino Linotype" w:hAnsi="Palatino Linotype"/>
+        </w:rPr>
+        <w:t>{.}</w:t>
+      </w:r>
+    </w:p>
+    <w:p>
+      <w:pPr>
+        <w:spacing w:after="0"/>
+        <w:rPr>
+          <w:rFonts w:ascii="Palatino Linotype" w:hAnsi="Palatino Linotype"/>
+        </w:rPr>
+      </w:pPr>
+      <w:r>
+        <w:rPr>
+          <w:rFonts w:ascii="Palatino Linotype" w:hAnsi="Palatino Linotype"/>
+        </w:rPr>
+        <w:t>{/descripciones}</w:t>
+      </w:r>
+    </w:p>
+    <w:p>
+      <w:pPr>
+        <w:spacing w:after="0"/>
+        <w:rPr>
+          <w:rFonts w:ascii="Palatino Linotype" w:hAnsi="Palatino Linotype"/>
+        </w:rPr>
+      </w:pPr>
+      <w:r>
+        <w:rPr>
+          <w:rFonts w:ascii="Palatino Linotype" w:hAnsi="Palatino Linotype"/>
+        </w:rPr>
         <w:t>{/experiencias}</w:t>
       </w:r>
     </w:p>
     <w:p>
       <w:pPr>
-        <w:spacing w:after="120" w:line="240" w:lineRule="auto"/>
+        <w:spacing w:after="0"/>
+        <w:jc w:val="both"/>
+        <w:rPr>
+          <w:rFonts w:ascii="Palatino Linotype" w:hAnsi="Palatino Linotype" w:cs="Calibri"/>
+          <w:sz w:val="22"/>
+          <w:szCs w:val="22"/>
+          <w:lang w:val="es-ES"/>
+        </w:rPr>
       </w:pPr>
       <w:r>
         <w:rPr>
           <w:noProof/>
-          <w:lang w:val="es-ES"/>
+          <w:lang w:eastAsia="es-MX"/>
         </w:rPr>
         <mc:AlternateContent>
           <mc:Choice Requires="wps">
@@ -457,7 +747,7 @@
               </wp:inline>
             </w:drawing>
           </mc:Choice>
-          <mc:Fallback>
+          <mc:Fallback xmlns:cx2="http://schemas.microsoft.com/office/drawing/2015/10/21/chartex" xmlns:cx3="http://schemas.microsoft.com/office/drawing/2016/5/9/chartex" xmlns:cx4="http://schemas.microsoft.com/office/drawing/2016/5/10/chartex" xmlns:cx5="http://schemas.microsoft.com/office/drawing/2016/5/11/chartex" xmlns:cx6="http://schemas.microsoft.com/office/drawing/2016/5/12/chartex" xmlns:cx7="http://schemas.microsoft.com/office/drawing/2016/5/13/chartex" xmlns:cx8="http://schemas.microsoft.com/office/drawing/2016/5/14/chartex" xmlns:aink="http://schemas.microsoft.com/office/drawing/2016/ink" xmlns:am3d="http://schemas.microsoft.com/office/drawing/2017/model3d" xmlns:oel="http://schemas.microsoft.com/office/2019/extlst" xmlns:w16cex="http://schemas.microsoft.com/office/word/2018/wordml/cex" xmlns:w16cid="http://schemas.microsoft.com/office/word/2016/wordml/cid" xmlns:w16="http://schemas.microsoft.com/office/word/2018/wordml" xmlns:w16sdtdh="http://schemas.microsoft.com/office/word/2020/wordml/sdtdatahash">
             <w:pict>
               <v:line w14:anchorId="6ACB160D" id="Conector recto 1" o:spid="_x0000_s1026" style="visibility:visible;mso-wrap-style:square;mso-left-percent:-10001;mso-top-percent:-10001;mso-position-horizontal:absolute;mso-position-horizontal-relative:char;mso-position-vertical:absolute;mso-position-vertical-relative:line;mso-left-percent:-10001;mso-top-percent:-10001" from="0,0" to="235.25pt,0" o:gfxdata="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" strokecolor="#adadad [2414]" strokeweight="1.5pt">
                 <v:stroke joinstyle="miter"/>
@@ -472,16 +762,20 @@
       <w:pPr>
         <w:spacing w:before="240" w:after="60"/>
         <w:rPr>
+          <w:rFonts w:ascii="Palatino Linotype" w:hAnsi="Palatino Linotype"/>
           <w:b/>
           <w:bCs/>
+          <w:i/>
           <w:color w:val="0070C0"/>
           <w:lang w:val="es-ES"/>
         </w:rPr>
       </w:pPr>
       <w:r>
         <w:rPr>
+          <w:rFonts w:ascii="Palatino Linotype" w:hAnsi="Palatino Linotype"/>
           <w:b/>
           <w:bCs/>
+          <w:i/>
           <w:color w:val="0070C0"/>
           <w:lang w:val="es-ES"/>
         </w:rPr>
@@ -490,182 +784,171 @@
     </w:p>
     <w:p>
       <w:pPr>
+        <w:spacing w:after="0"/>
+        <w:jc w:val="both"/>
+        <w:rPr>
+          <w:rFonts w:ascii="Palatino Linotype" w:hAnsi="Palatino Linotype" w:cs="Calibri"/>
+          <w:sz w:val="22"/>
+          <w:szCs w:val="22"/>
+          <w:lang w:val="es-ES"/>
+        </w:rPr>
+      </w:pPr>
+      <w:r>
+        <w:rPr>
+          <w:rFonts w:ascii="Palatino Linotype" w:hAnsi="Palatino Linotype" w:cs="Calibri"/>
+          <w:sz w:val="22"/>
+          <w:szCs w:val="22"/>
+          <w:lang w:val="es-ES"/>
+        </w:rPr>
+        <w:t>{#estudios}</w:t>
+      </w:r>
+    </w:p>
+    <w:p>
+      <w:pPr>
+        <w:spacing w:after="0"/>
+        <w:jc w:val="both"/>
+        <w:rPr>
+          <w:rFonts w:ascii="Palatino Linotype" w:hAnsi="Palatino Linotype" w:cs="Calibri"/>
+          <w:b/>
+          <w:szCs w:val="22"/>
+          <w:lang w:val="es-ES"/>
+        </w:rPr>
+      </w:pPr>
+      <w:r>
+        <w:rPr>
+          <w:rFonts w:ascii="Palatino Linotype" w:hAnsi="Palatino Linotype" w:cs="Calibri"/>
+          <w:b/>
+          <w:szCs w:val="22"/>
+          <w:lang w:val="es-ES"/>
+        </w:rPr>
+        <w:t>{universidad}</w:t>
+      </w:r>
+    </w:p>
+    <w:p>
+      <w:pPr>
+        <w:spacing w:after="0"/>
+        <w:jc w:val="both"/>
+        <w:rPr>
+          <w:rFonts w:ascii="Palatino Linotype" w:hAnsi="Palatino Linotype" w:cs="Calibri"/>
+          <w:sz w:val="22"/>
+          <w:szCs w:val="22"/>
+          <w:lang w:val="es-ES"/>
+        </w:rPr>
+      </w:pPr>
+      <w:r>
+        <w:rPr>
+          <w:rFonts w:ascii="Palatino Linotype" w:hAnsi="Palatino Linotype" w:cs="Calibri"/>
+          <w:sz w:val="22"/>
+          <w:szCs w:val="22"/>
+          <w:lang w:val="es-ES"/>
+        </w:rPr>
+        <w:t>{carrera}-{</w:t>
+      </w:r>
+      <w:proofErr w:type="spellStart"/>
+      <w:r>
+        <w:rPr>
+          <w:rFonts w:ascii="Palatino Linotype" w:hAnsi="Palatino Linotype" w:cs="Calibri"/>
+          <w:sz w:val="22"/>
+          <w:szCs w:val="22"/>
+          <w:lang w:val="es-ES"/>
+        </w:rPr>
+        <w:t>fechaIni</w:t>
+      </w:r>
+      <w:proofErr w:type="spellEnd"/>
+      <w:r>
+        <w:rPr>
+          <w:rFonts w:ascii="Palatino Linotype" w:hAnsi="Palatino Linotype" w:cs="Calibri"/>
+          <w:sz w:val="22"/>
+          <w:szCs w:val="22"/>
+          <w:lang w:val="es-ES"/>
+        </w:rPr>
+        <w:t>}-{</w:t>
+      </w:r>
+      <w:proofErr w:type="spellStart"/>
+      <w:r>
+        <w:rPr>
+          <w:rFonts w:ascii="Palatino Linotype" w:hAnsi="Palatino Linotype" w:cs="Calibri"/>
+          <w:sz w:val="22"/>
+          <w:szCs w:val="22"/>
+          <w:lang w:val="es-ES"/>
+        </w:rPr>
+        <w:t>generacion</w:t>
+      </w:r>
+      <w:proofErr w:type="spellEnd"/>
+      <w:r>
+        <w:rPr>
+          <w:rFonts w:ascii="Palatino Linotype" w:hAnsi="Palatino Linotype" w:cs="Calibri"/>
+          <w:sz w:val="22"/>
+          <w:szCs w:val="22"/>
+          <w:lang w:val="es-ES"/>
+        </w:rPr>
+        <w:t>}</w:t>
+      </w:r>
+    </w:p>
+    <w:p>
+      <w:pPr>
+        <w:spacing w:after="0"/>
+        <w:jc w:val="both"/>
+        <w:rPr>
+          <w:rFonts w:ascii="Palatino Linotype" w:hAnsi="Palatino Linotype" w:cs="Calibri"/>
+          <w:sz w:val="22"/>
+          <w:szCs w:val="22"/>
+          <w:lang w:val="es-ES"/>
+        </w:rPr>
+      </w:pPr>
+      <w:r>
+        <w:rPr>
+          <w:rFonts w:ascii="Palatino Linotype" w:hAnsi="Palatino Linotype" w:cs="Calibri"/>
+          <w:sz w:val="22"/>
+          <w:szCs w:val="22"/>
+          <w:lang w:val="es-ES"/>
+        </w:rPr>
+        <w:t>{/estudios}</w:t>
+      </w:r>
+    </w:p>
+    <w:p>
+      <w:pPr>
+        <w:spacing w:after="120" w:line="240" w:lineRule="auto"/>
+        <w:rPr>
+          <w:rFonts w:ascii="Palatino Linotype" w:hAnsi="Palatino Linotype" w:cs="Calibri"/>
+          <w:sz w:val="22"/>
+          <w:szCs w:val="22"/>
+          <w:lang w:val="es-ES"/>
+        </w:rPr>
+      </w:pPr>
+      <w:r>
+        <w:rPr>
+          <w:rFonts w:ascii="Palatino Linotype" w:hAnsi="Palatino Linotype" w:cs="Calibri"/>
+          <w:sz w:val="22"/>
+          <w:szCs w:val="22"/>
+          <w:lang w:val="es-ES"/>
+        </w:rPr>
+        <w:t>{#</w:t>
+      </w:r>
+      <w:proofErr w:type="spellStart"/>
+      <w:r>
+        <w:rPr>
+          <w:rFonts w:ascii="Palatino Linotype" w:hAnsi="Palatino Linotype" w:cs="Calibri"/>
+          <w:sz w:val="22"/>
+          <w:szCs w:val="22"/>
+          <w:lang w:val="es-ES"/>
+        </w:rPr>
+        <w:t>tieneCursos</w:t>
+      </w:r>
+      <w:proofErr w:type="spellEnd"/>
+      <w:r>
+        <w:rPr>
+          <w:rFonts w:ascii="Palatino Linotype" w:hAnsi="Palatino Linotype" w:cs="Calibri"/>
+          <w:sz w:val="22"/>
+          <w:szCs w:val="22"/>
+          <w:lang w:val="es-ES"/>
+        </w:rPr>
+        <w:t>}</w:t>
+      </w:r>
+    </w:p>
+    <w:p>
+      <w:pPr>
         <w:spacing w:after="60"/>
-      </w:pPr>
-      <w:r>
-        <w:rPr>
-          <w:lang w:val="es-ES"/>
-        </w:rPr>
-        <w:t>{#</w:t>
-      </w:r>
-      <w:r>
-        <w:t>estudios</w:t>
-      </w:r>
-      <w:r>
-        <w:rPr>
-          <w:lang w:val="es-ES"/>
-        </w:rPr>
-        <w:t>}</w:t>
-      </w:r>
-    </w:p>
-    <w:p>
-      <w:pPr>
-        <w:spacing w:after="60"/>
-        <w:rPr>
-          <w:b/>
-          <w:bCs/>
-          <w:lang w:val="es-ES"/>
-        </w:rPr>
-      </w:pPr>
-      <w:r>
-        <w:rPr>
-          <w:b/>
-          <w:bCs/>
-          <w:lang w:val="es-ES"/>
-        </w:rPr>
-        <w:t>{universidad}</w:t>
-      </w:r>
-    </w:p>
-    <w:p>
-      <w:pPr>
-        <w:spacing w:after="60"/>
-        <w:rPr>
-          <w:lang w:val="es-ES"/>
-        </w:rPr>
-      </w:pPr>
-      <w:r>
-        <w:rPr>
-          <w:lang w:val="es-ES"/>
-        </w:rPr>
-        <w:t>{carrera}</w:t>
-      </w:r>
-    </w:p>
-    <w:p>
-      <w:pPr>
-        <w:spacing w:after="60"/>
-        <w:rPr>
-          <w:b/>
-          <w:bCs/>
-          <w:u w:val="single"/>
-          <w:lang w:val="es-ES"/>
-        </w:rPr>
-      </w:pPr>
-      <w:r>
-        <w:rPr>
-          <w:lang w:val="es-ES"/>
-        </w:rPr>
-        <w:t>Fecha de inicio:</w:t>
-      </w:r>
-      <w:r>
-        <w:rPr>
-          <w:b/>
-          <w:bCs/>
-          <w:lang w:val="es-ES"/>
-        </w:rPr>
-        <w:t xml:space="preserve"> {</w:t>
-      </w:r>
-      <w:proofErr w:type="spellStart"/>
-      <w:r>
-        <w:rPr>
-          <w:b/>
-          <w:bCs/>
-          <w:lang w:val="es-ES"/>
-        </w:rPr>
-        <w:t>fechaIni</w:t>
-      </w:r>
-      <w:proofErr w:type="spellEnd"/>
-      <w:r>
-        <w:rPr>
-          <w:b/>
-          <w:bCs/>
-          <w:lang w:val="es-ES"/>
-        </w:rPr>
-        <w:t>}</w:t>
-      </w:r>
-    </w:p>
-    <w:p>
-      <w:pPr>
-        <w:spacing w:after="60"/>
-        <w:rPr>
-          <w:b/>
-          <w:bCs/>
-          <w:lang w:val="es-ES"/>
-        </w:rPr>
-      </w:pPr>
-      <w:r>
-        <w:rPr>
-          <w:lang w:val="es-ES"/>
-        </w:rPr>
-        <w:t>Generación:</w:t>
-      </w:r>
-      <w:r>
-        <w:rPr>
-          <w:b/>
-          <w:bCs/>
-          <w:lang w:val="es-ES"/>
-        </w:rPr>
-        <w:t xml:space="preserve"> {</w:t>
-      </w:r>
-      <w:proofErr w:type="spellStart"/>
-      <w:r>
-        <w:rPr>
-          <w:b/>
-          <w:bCs/>
-          <w:u w:val="single"/>
-          <w:lang w:val="es-ES"/>
-        </w:rPr>
-        <w:t>generacion</w:t>
-      </w:r>
-      <w:proofErr w:type="spellEnd"/>
-      <w:r>
-        <w:rPr>
-          <w:b/>
-          <w:bCs/>
-          <w:lang w:val="es-ES"/>
-        </w:rPr>
-        <w:t>}</w:t>
-      </w:r>
-    </w:p>
-    <w:p>
-      <w:pPr>
-        <w:spacing w:after="60"/>
-        <w:rPr>
-          <w:lang w:val="es-ES"/>
-        </w:rPr>
-      </w:pPr>
-      <w:r>
-        <w:rPr>
-          <w:lang w:val="es-ES"/>
-        </w:rPr>
-        <w:t>{/</w:t>
-      </w:r>
-      <w:r>
-        <w:t>estudios</w:t>
-      </w:r>
-      <w:r>
-        <w:rPr>
-          <w:lang w:val="es-ES"/>
-        </w:rPr>
-        <w:t>}</w:t>
-      </w:r>
-    </w:p>
-    <w:p>
-      <w:pPr>
-        <w:spacing w:after="60"/>
-        <w:rPr>
-          <w:lang w:val="es-ES"/>
-        </w:rPr>
-      </w:pPr>
-      <w:r>
-        <w:rPr>
-          <w:lang w:val="es-ES"/>
-        </w:rPr>
-        <w:t>{#tieneCursos}</w:t>
-      </w:r>
-    </w:p>
-    <w:p>
-      <w:pPr>
-        <w:spacing w:after="60"/>
         <w:rPr>
           <w:lang w:val="es-ES"/>
         </w:rPr>
@@ -673,7 +956,7 @@
       <w:r>
         <w:rPr>
           <w:noProof/>
-          <w:lang w:val="es-ES"/>
+          <w:lang w:eastAsia="es-MX"/>
         </w:rPr>
         <mc:AlternateContent>
           <mc:Choice Requires="wps">
@@ -724,7 +1007,7 @@
               </wp:inline>
             </w:drawing>
           </mc:Choice>
-          <mc:Fallback>
+          <mc:Fallback xmlns:cx2="http://schemas.microsoft.com/office/drawing/2015/10/21/chartex" xmlns:cx3="http://schemas.microsoft.com/office/drawing/2016/5/9/chartex" xmlns:cx4="http://schemas.microsoft.com/office/drawing/2016/5/10/chartex" xmlns:cx5="http://schemas.microsoft.com/office/drawing/2016/5/11/chartex" xmlns:cx6="http://schemas.microsoft.com/office/drawing/2016/5/12/chartex" xmlns:cx7="http://schemas.microsoft.com/office/drawing/2016/5/13/chartex" xmlns:cx8="http://schemas.microsoft.com/office/drawing/2016/5/14/chartex" xmlns:aink="http://schemas.microsoft.com/office/drawing/2016/ink" xmlns:am3d="http://schemas.microsoft.com/office/drawing/2017/model3d" xmlns:oel="http://schemas.microsoft.com/office/2019/extlst" xmlns:w16cex="http://schemas.microsoft.com/office/word/2018/wordml/cex" xmlns:w16cid="http://schemas.microsoft.com/office/word/2016/wordml/cid" xmlns:w16="http://schemas.microsoft.com/office/word/2018/wordml" xmlns:w16sdtdh="http://schemas.microsoft.com/office/word/2020/wordml/sdtdatahash">
             <w:pict>
               <v:line w14:anchorId="06D2E983" id="Conector recto 2" o:spid="_x0000_s1026" style="visibility:visible;mso-wrap-style:square;mso-left-percent:-10001;mso-top-percent:-10001;mso-position-horizontal:absolute;mso-position-horizontal-relative:char;mso-position-vertical:absolute;mso-position-vertical-relative:line;mso-left-percent:-10001;mso-top-percent:-10001" from="0,0" to="235.25pt,0" o:gfxdata="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" strokecolor="#adadad [2414]" strokeweight="1.5pt">
                 <v:stroke joinstyle="miter"/>
@@ -739,31 +1022,42 @@
       <w:pPr>
         <w:spacing w:before="240" w:after="60"/>
         <w:rPr>
+          <w:rFonts w:ascii="Palatino Linotype" w:hAnsi="Palatino Linotype"/>
           <w:b/>
           <w:bCs/>
+          <w:i/>
           <w:color w:val="0070C0"/>
-          <w:lang w:val="es-ES"/>
-        </w:rPr>
-      </w:pPr>
-      <w:r>
-        <w:rPr>
+          <w:u w:val="single"/>
+          <w:lang w:val="es-ES"/>
+        </w:rPr>
+      </w:pPr>
+      <w:r>
+        <w:rPr>
+          <w:rFonts w:ascii="Palatino Linotype" w:hAnsi="Palatino Linotype"/>
           <w:b/>
           <w:bCs/>
+          <w:i/>
           <w:color w:val="0070C0"/>
           <w:lang w:val="es-ES"/>
         </w:rPr>
-        <w:t>OTROS ESTUDIOS</w:t>
-      </w:r>
-    </w:p>
-    <w:p>
-      <w:pPr>
-        <w:spacing w:after="60"/>
-        <w:rPr>
-          <w:lang w:val="es-ES"/>
-        </w:rPr>
-      </w:pPr>
-      <w:r>
-        <w:rPr>
+        <w:t>CERTIFICACIONES</w:t>
+      </w:r>
+    </w:p>
+    <w:p>
+      <w:pPr>
+        <w:spacing w:after="120" w:line="240" w:lineRule="auto"/>
+        <w:rPr>
+          <w:rFonts w:ascii="Palatino Linotype" w:hAnsi="Palatino Linotype" w:cs="Calibri"/>
+          <w:sz w:val="22"/>
+          <w:szCs w:val="22"/>
+          <w:lang w:val="es-ES"/>
+        </w:rPr>
+      </w:pPr>
+      <w:r>
+        <w:rPr>
+          <w:rFonts w:ascii="Palatino Linotype" w:hAnsi="Palatino Linotype" w:cs="Calibri"/>
+          <w:sz w:val="22"/>
+          <w:szCs w:val="22"/>
           <w:lang w:val="es-ES"/>
         </w:rPr>
         <w:t>{#cursos}</w:t>
@@ -771,38 +1065,33 @@
     </w:p>
     <w:p>
       <w:pPr>
-        <w:spacing w:after="60"/>
-        <w:rPr>
+        <w:spacing w:after="0"/>
+        <w:jc w:val="both"/>
+        <w:rPr>
+          <w:rFonts w:ascii="Palatino Linotype" w:hAnsi="Palatino Linotype" w:cs="Calibri"/>
           <w:b/>
-          <w:bCs/>
-          <w:lang w:val="es-ES"/>
-        </w:rPr>
-      </w:pPr>
-      <w:r>
-        <w:rPr>
+          <w:sz w:val="22"/>
+          <w:szCs w:val="22"/>
+          <w:lang w:val="es-ES"/>
+        </w:rPr>
+      </w:pPr>
+      <w:r>
+        <w:rPr>
+          <w:rFonts w:ascii="Palatino Linotype" w:hAnsi="Palatino Linotype" w:cs="Calibri"/>
           <w:b/>
-          <w:bCs/>
-          <w:lang w:val="es-ES"/>
-        </w:rPr>
-        <w:t>{nombre}</w:t>
-      </w:r>
-    </w:p>
-    <w:p>
-      <w:pPr>
-        <w:spacing w:after="60"/>
-        <w:rPr>
-          <w:lang w:val="es-ES"/>
-        </w:rPr>
-      </w:pPr>
-      <w:r>
-        <w:rPr>
-          <w:lang w:val="es-ES"/>
-        </w:rPr>
-        <w:t>{</w:t>
+          <w:sz w:val="22"/>
+          <w:szCs w:val="22"/>
+          <w:lang w:val="es-ES"/>
+        </w:rPr>
+        <w:t>• {nombre} ({</w:t>
       </w:r>
       <w:proofErr w:type="spellStart"/>
       <w:r>
         <w:rPr>
+          <w:rFonts w:ascii="Palatino Linotype" w:hAnsi="Palatino Linotype" w:cs="Calibri"/>
+          <w:b/>
+          <w:sz w:val="22"/>
+          <w:szCs w:val="22"/>
           <w:lang w:val="es-ES"/>
         </w:rPr>
         <w:t>organizacion</w:t>
@@ -810,6 +1099,51 @@
       <w:proofErr w:type="spellEnd"/>
       <w:r>
         <w:rPr>
+          <w:rFonts w:ascii="Palatino Linotype" w:hAnsi="Palatino Linotype" w:cs="Calibri"/>
+          <w:b/>
+          <w:sz w:val="22"/>
+          <w:szCs w:val="22"/>
+          <w:lang w:val="es-ES"/>
+        </w:rPr>
+        <w:t>}, {periodo})</w:t>
+      </w:r>
+    </w:p>
+    <w:p>
+      <w:pPr>
+        <w:spacing w:after="0"/>
+        <w:jc w:val="both"/>
+        <w:rPr>
+          <w:rFonts w:ascii="Palatino Linotype" w:hAnsi="Palatino Linotype" w:cs="Calibri"/>
+          <w:sz w:val="22"/>
+          <w:szCs w:val="22"/>
+          <w:lang w:val="es-ES"/>
+        </w:rPr>
+      </w:pPr>
+      <w:r>
+        <w:rPr>
+          <w:rFonts w:ascii="Palatino Linotype" w:hAnsi="Palatino Linotype" w:cs="Calibri"/>
+          <w:sz w:val="22"/>
+          <w:szCs w:val="22"/>
+          <w:lang w:val="es-ES"/>
+        </w:rPr>
+        <w:t>Descripción: {</w:t>
+      </w:r>
+      <w:proofErr w:type="spellStart"/>
+      <w:r>
+        <w:rPr>
+          <w:rFonts w:ascii="Palatino Linotype" w:hAnsi="Palatino Linotype" w:cs="Calibri"/>
+          <w:sz w:val="22"/>
+          <w:szCs w:val="22"/>
+          <w:lang w:val="es-ES"/>
+        </w:rPr>
+        <w:t>descripcion</w:t>
+      </w:r>
+      <w:proofErr w:type="spellEnd"/>
+      <w:r>
+        <w:rPr>
+          <w:rFonts w:ascii="Palatino Linotype" w:hAnsi="Palatino Linotype" w:cs="Calibri"/>
+          <w:sz w:val="22"/>
+          <w:szCs w:val="22"/>
           <w:lang w:val="es-ES"/>
         </w:rPr>
         <w:t>}</w:t>
@@ -817,34 +1151,50 @@
     </w:p>
     <w:p>
       <w:pPr>
-        <w:spacing w:after="60"/>
-        <w:rPr>
-          <w:lang w:val="es-ES"/>
-        </w:rPr>
-      </w:pPr>
-      <w:r>
-        <w:rPr>
-          <w:lang w:val="es-ES"/>
-        </w:rPr>
-        <w:t>{periodo}</w:t>
-      </w:r>
-    </w:p>
-    <w:p>
-      <w:pPr>
-        <w:spacing w:after="60"/>
-        <w:rPr>
-          <w:lang w:val="es-ES"/>
-        </w:rPr>
-      </w:pPr>
-      <w:r>
-        <w:rPr>
-          <w:lang w:val="es-ES"/>
-        </w:rPr>
-        <w:t>{entidad} - {</w:t>
+        <w:spacing w:after="0"/>
+        <w:jc w:val="both"/>
+        <w:rPr>
+          <w:rFonts w:ascii="Palatino Linotype" w:hAnsi="Palatino Linotype" w:cs="Calibri"/>
+          <w:sz w:val="22"/>
+          <w:szCs w:val="22"/>
+          <w:lang w:val="es-ES"/>
+        </w:rPr>
+      </w:pPr>
+      <w:r>
+        <w:rPr>
+          <w:rFonts w:ascii="Palatino Linotype" w:hAnsi="Palatino Linotype" w:cs="Calibri"/>
+          <w:sz w:val="22"/>
+          <w:szCs w:val="22"/>
+          <w:lang w:val="es-ES"/>
+        </w:rPr>
+        <w:t>Entidad: {entidad}</w:t>
+      </w:r>
+    </w:p>
+    <w:p>
+      <w:pPr>
+        <w:jc w:val="both"/>
+        <w:rPr>
+          <w:rFonts w:ascii="Palatino Linotype" w:hAnsi="Palatino Linotype" w:cs="Calibri"/>
+          <w:sz w:val="22"/>
+          <w:szCs w:val="22"/>
+          <w:lang w:val="es-ES"/>
+        </w:rPr>
+      </w:pPr>
+      <w:r>
+        <w:rPr>
+          <w:rFonts w:ascii="Palatino Linotype" w:hAnsi="Palatino Linotype" w:cs="Calibri"/>
+          <w:sz w:val="22"/>
+          <w:szCs w:val="22"/>
+          <w:lang w:val="es-ES"/>
+        </w:rPr>
+        <w:t>Tiempo de estudios: {</w:t>
       </w:r>
       <w:proofErr w:type="spellStart"/>
       <w:r>
         <w:rPr>
+          <w:rFonts w:ascii="Palatino Linotype" w:hAnsi="Palatino Linotype" w:cs="Calibri"/>
+          <w:sz w:val="22"/>
+          <w:szCs w:val="22"/>
           <w:lang w:val="es-ES"/>
         </w:rPr>
         <w:t>tiempoEstudio</w:t>
@@ -852,6 +1202,9 @@
       <w:proofErr w:type="spellEnd"/>
       <w:r>
         <w:rPr>
+          <w:rFonts w:ascii="Palatino Linotype" w:hAnsi="Palatino Linotype" w:cs="Calibri"/>
+          <w:sz w:val="22"/>
+          <w:szCs w:val="22"/>
           <w:lang w:val="es-ES"/>
         </w:rPr>
         <w:t>}</w:t>
@@ -859,27 +1212,61 @@
     </w:p>
     <w:p>
       <w:pPr>
-        <w:spacing w:after="60"/>
-        <w:rPr>
-          <w:lang w:val="es-ES"/>
-        </w:rPr>
-      </w:pPr>
-      <w:r>
-        <w:rPr>
-          <w:lang w:val="es-ES"/>
-        </w:rPr>
-        <w:t>{</w:t>
+        <w:spacing w:after="120" w:line="240" w:lineRule="auto"/>
+        <w:rPr>
+          <w:rFonts w:ascii="Palatino Linotype" w:hAnsi="Palatino Linotype" w:cs="Calibri"/>
+          <w:sz w:val="22"/>
+          <w:szCs w:val="22"/>
+          <w:u w:val="single"/>
+          <w:lang w:val="es-ES"/>
+        </w:rPr>
+      </w:pPr>
+      <w:r>
+        <w:rPr>
+          <w:rFonts w:ascii="Palatino Linotype" w:hAnsi="Palatino Linotype" w:cs="Calibri"/>
+          <w:sz w:val="22"/>
+          <w:szCs w:val="22"/>
+          <w:lang w:val="es-ES"/>
+        </w:rPr>
+        <w:t>{/cursos}</w:t>
+      </w:r>
+    </w:p>
+    <w:p>
+      <w:pPr>
+        <w:spacing w:after="120" w:line="240" w:lineRule="auto"/>
+        <w:rPr>
+          <w:rFonts w:ascii="Palatino Linotype" w:hAnsi="Palatino Linotype" w:cs="Calibri"/>
+          <w:sz w:val="22"/>
+          <w:szCs w:val="22"/>
+          <w:u w:val="single"/>
+          <w:lang w:val="es-ES"/>
+        </w:rPr>
+      </w:pPr>
+      <w:r>
+        <w:rPr>
+          <w:rFonts w:ascii="Palatino Linotype" w:hAnsi="Palatino Linotype" w:cs="Calibri"/>
+          <w:sz w:val="22"/>
+          <w:szCs w:val="22"/>
+          <w:lang w:val="es-ES"/>
+        </w:rPr>
+        <w:t>{/</w:t>
       </w:r>
       <w:proofErr w:type="spellStart"/>
       <w:r>
         <w:rPr>
-          <w:lang w:val="es-ES"/>
-        </w:rPr>
-        <w:t>descripcion</w:t>
+          <w:rFonts w:ascii="Palatino Linotype" w:hAnsi="Palatino Linotype" w:cs="Calibri"/>
+          <w:sz w:val="22"/>
+          <w:szCs w:val="22"/>
+          <w:lang w:val="es-ES"/>
+        </w:rPr>
+        <w:t>tieneCursos</w:t>
       </w:r>
       <w:proofErr w:type="spellEnd"/>
       <w:r>
         <w:rPr>
+          <w:rFonts w:ascii="Palatino Linotype" w:hAnsi="Palatino Linotype" w:cs="Calibri"/>
+          <w:sz w:val="22"/>
+          <w:szCs w:val="22"/>
           <w:lang w:val="es-ES"/>
         </w:rPr>
         <w:t>}</w:t>
@@ -887,71 +1274,47 @@
     </w:p>
     <w:p>
       <w:pPr>
-        <w:spacing w:after="60"/>
-        <w:rPr>
-          <w:lang w:val="es-ES"/>
-        </w:rPr>
-      </w:pPr>
-      <w:r>
-        <w:rPr>
-          <w:lang w:val="es-ES"/>
-        </w:rPr>
-        <w:t>{/cursos}</w:t>
-      </w:r>
-    </w:p>
-    <w:p>
-      <w:pPr>
-        <w:spacing w:after="60"/>
-        <w:rPr>
-          <w:lang w:val="es-ES"/>
-        </w:rPr>
-      </w:pPr>
-      <w:r>
-        <w:rPr>
-          <w:lang w:val="es-ES"/>
-        </w:rPr>
-        <w:t>{/</w:t>
+        <w:spacing w:after="120" w:line="240" w:lineRule="auto"/>
+        <w:rPr>
+          <w:rFonts w:ascii="Palatino Linotype" w:hAnsi="Palatino Linotype" w:cs="Calibri"/>
+          <w:sz w:val="22"/>
+          <w:szCs w:val="22"/>
+          <w:lang w:val="es-ES"/>
+        </w:rPr>
+      </w:pPr>
+      <w:r>
+        <w:rPr>
+          <w:rFonts w:ascii="Palatino Linotype" w:hAnsi="Palatino Linotype" w:cs="Calibri"/>
+          <w:sz w:val="22"/>
+          <w:szCs w:val="22"/>
+          <w:lang w:val="es-ES"/>
+        </w:rPr>
+        <w:t>{#</w:t>
       </w:r>
       <w:proofErr w:type="spellStart"/>
       <w:r>
         <w:rPr>
-          <w:lang w:val="es-ES"/>
-        </w:rPr>
-        <w:t>tieneCursos</w:t>
+          <w:rFonts w:ascii="Palatino Linotype" w:hAnsi="Palatino Linotype" w:cs="Calibri"/>
+          <w:sz w:val="22"/>
+          <w:szCs w:val="22"/>
+          <w:lang w:val="es-ES"/>
+        </w:rPr>
+        <w:t>tieneConocimientos</w:t>
       </w:r>
       <w:proofErr w:type="spellEnd"/>
       <w:r>
         <w:rPr>
+          <w:rFonts w:ascii="Palatino Linotype" w:hAnsi="Palatino Linotype" w:cs="Calibri"/>
+          <w:sz w:val="22"/>
+          <w:szCs w:val="22"/>
           <w:lang w:val="es-ES"/>
         </w:rPr>
         <w:t>}</w:t>
       </w:r>
-    </w:p>
-    <w:p>
-      <w:pPr>
-        <w:spacing w:after="60"/>
-        <w:rPr>
-          <w:lang w:val="es-ES"/>
-        </w:rPr>
-      </w:pPr>
-      <w:r>
-        <w:rPr>
-          <w:lang w:val="es-ES"/>
-        </w:rPr>
-        <w:t>{#tieneConocimientos}</w:t>
-      </w:r>
-    </w:p>
-    <w:p>
-      <w:pPr>
-        <w:spacing w:after="60"/>
-        <w:rPr>
-          <w:lang w:val="es-ES"/>
-        </w:rPr>
-      </w:pPr>
       <w:r>
         <w:rPr>
           <w:noProof/>
-          <w:lang w:val="es-ES"/>
+          <w:lang w:eastAsia="es-MX"/>
         </w:rPr>
         <mc:AlternateContent>
           <mc:Choice Requires="wps">
@@ -1002,7 +1365,7 @@
               </wp:inline>
             </w:drawing>
           </mc:Choice>
-          <mc:Fallback>
+          <mc:Fallback xmlns:cx2="http://schemas.microsoft.com/office/drawing/2015/10/21/chartex" xmlns:cx3="http://schemas.microsoft.com/office/drawing/2016/5/9/chartex" xmlns:cx4="http://schemas.microsoft.com/office/drawing/2016/5/10/chartex" xmlns:cx5="http://schemas.microsoft.com/office/drawing/2016/5/11/chartex" xmlns:cx6="http://schemas.microsoft.com/office/drawing/2016/5/12/chartex" xmlns:cx7="http://schemas.microsoft.com/office/drawing/2016/5/13/chartex" xmlns:cx8="http://schemas.microsoft.com/office/drawing/2016/5/14/chartex" xmlns:aink="http://schemas.microsoft.com/office/drawing/2016/ink" xmlns:am3d="http://schemas.microsoft.com/office/drawing/2017/model3d" xmlns:oel="http://schemas.microsoft.com/office/2019/extlst" xmlns:w16cex="http://schemas.microsoft.com/office/word/2018/wordml/cex" xmlns:w16cid="http://schemas.microsoft.com/office/word/2016/wordml/cid" xmlns:w16="http://schemas.microsoft.com/office/word/2018/wordml" xmlns:w16sdtdh="http://schemas.microsoft.com/office/word/2020/wordml/sdtdatahash">
             <w:pict>
               <v:line w14:anchorId="5567C60D" id="Conector recto 3" o:spid="_x0000_s1026" style="visibility:visible;mso-wrap-style:square;mso-left-percent:-10001;mso-top-percent:-10001;mso-position-horizontal:absolute;mso-position-horizontal-relative:char;mso-position-vertical:absolute;mso-position-vertical-relative:line;mso-left-percent:-10001;mso-top-percent:-10001" from="0,0" to="235.25pt,0" o:gfxdata="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" strokecolor="#adadad [2414]" strokeweight="1.5pt">
                 <v:stroke joinstyle="miter"/>
@@ -1017,16 +1380,20 @@
       <w:pPr>
         <w:spacing w:before="240" w:after="60"/>
         <w:rPr>
+          <w:rFonts w:ascii="Palatino Linotype" w:hAnsi="Palatino Linotype"/>
           <w:b/>
           <w:bCs/>
+          <w:i/>
           <w:color w:val="0070C0"/>
           <w:lang w:val="es-ES"/>
         </w:rPr>
       </w:pPr>
       <w:r>
         <w:rPr>
+          <w:rFonts w:ascii="Palatino Linotype" w:hAnsi="Palatino Linotype"/>
           <w:b/>
           <w:bCs/>
+          <w:i/>
           <w:color w:val="0070C0"/>
           <w:lang w:val="es-ES"/>
         </w:rPr>
@@ -1035,13 +1402,19 @@
     </w:p>
     <w:p>
       <w:pPr>
-        <w:spacing w:after="60"/>
-        <w:rPr>
-          <w:lang w:val="es-ES"/>
-        </w:rPr>
-      </w:pPr>
-      <w:r>
-        <w:rPr>
+        <w:spacing w:after="120" w:line="240" w:lineRule="auto"/>
+        <w:rPr>
+          <w:rFonts w:ascii="Palatino Linotype" w:hAnsi="Palatino Linotype" w:cs="Calibri"/>
+          <w:sz w:val="22"/>
+          <w:szCs w:val="22"/>
+          <w:lang w:val="es-ES"/>
+        </w:rPr>
+      </w:pPr>
+      <w:r>
+        <w:rPr>
+          <w:rFonts w:ascii="Palatino Linotype" w:hAnsi="Palatino Linotype" w:cs="Calibri"/>
+          <w:sz w:val="22"/>
+          <w:szCs w:val="22"/>
           <w:lang w:val="es-ES"/>
         </w:rPr>
         <w:t>{#conocimientos}</w:t>
@@ -1049,19 +1422,28 @@
     </w:p>
     <w:p>
       <w:pPr>
-        <w:spacing w:after="60"/>
-        <w:rPr>
-          <w:lang w:val="es-ES"/>
-        </w:rPr>
-      </w:pPr>
-      <w:r>
-        <w:rPr>
+        <w:spacing w:after="120" w:line="240" w:lineRule="auto"/>
+        <w:rPr>
+          <w:rFonts w:ascii="Palatino Linotype" w:hAnsi="Palatino Linotype" w:cs="Calibri"/>
+          <w:sz w:val="22"/>
+          <w:szCs w:val="22"/>
+          <w:lang w:val="es-ES"/>
+        </w:rPr>
+      </w:pPr>
+      <w:r>
+        <w:rPr>
+          <w:rFonts w:ascii="Palatino Linotype" w:hAnsi="Palatino Linotype" w:cs="Calibri"/>
+          <w:sz w:val="22"/>
+          <w:szCs w:val="22"/>
           <w:lang w:val="es-ES"/>
         </w:rPr>
         <w:t>•</w:t>
       </w:r>
       <w:r>
         <w:rPr>
+          <w:rFonts w:ascii="Palatino Linotype" w:hAnsi="Palatino Linotype" w:cs="Calibri"/>
+          <w:sz w:val="22"/>
+          <w:szCs w:val="22"/>
           <w:lang w:val="es-ES"/>
         </w:rPr>
         <w:tab/>
@@ -1070,6 +1452,86 @@
     </w:p>
     <w:p>
       <w:pPr>
+        <w:spacing w:after="120" w:line="240" w:lineRule="auto"/>
+        <w:rPr>
+          <w:rFonts w:ascii="Palatino Linotype" w:hAnsi="Palatino Linotype" w:cs="Calibri"/>
+          <w:sz w:val="22"/>
+          <w:szCs w:val="22"/>
+          <w:lang w:val="es-ES"/>
+        </w:rPr>
+      </w:pPr>
+      <w:r>
+        <w:rPr>
+          <w:rFonts w:ascii="Palatino Linotype" w:hAnsi="Palatino Linotype" w:cs="Calibri"/>
+          <w:sz w:val="22"/>
+          <w:szCs w:val="22"/>
+          <w:lang w:val="es-ES"/>
+        </w:rPr>
+        <w:t>{/conocimientos}</w:t>
+      </w:r>
+    </w:p>
+    <w:p>
+      <w:pPr>
+        <w:spacing w:after="120" w:line="240" w:lineRule="auto"/>
+        <w:rPr>
+          <w:rFonts w:ascii="Palatino Linotype" w:hAnsi="Palatino Linotype" w:cs="Calibri"/>
+          <w:sz w:val="22"/>
+          <w:szCs w:val="22"/>
+          <w:lang w:val="es-ES"/>
+        </w:rPr>
+      </w:pPr>
+      <w:r>
+        <w:rPr>
+          <w:rFonts w:ascii="Palatino Linotype" w:hAnsi="Palatino Linotype" w:cs="Calibri"/>
+          <w:sz w:val="22"/>
+          <w:szCs w:val="22"/>
+          <w:lang w:val="es-ES"/>
+        </w:rPr>
+        <w:t>{/</w:t>
+      </w:r>
+      <w:proofErr w:type="spellStart"/>
+      <w:r>
+        <w:rPr>
+          <w:rFonts w:ascii="Palatino Linotype" w:hAnsi="Palatino Linotype" w:cs="Calibri"/>
+          <w:sz w:val="22"/>
+          <w:szCs w:val="22"/>
+          <w:lang w:val="es-ES"/>
+        </w:rPr>
+        <w:t>tieneConocimientos</w:t>
+      </w:r>
+      <w:proofErr w:type="spellEnd"/>
+      <w:r>
+        <w:rPr>
+          <w:rFonts w:ascii="Palatino Linotype" w:hAnsi="Palatino Linotype" w:cs="Calibri"/>
+          <w:sz w:val="22"/>
+          <w:szCs w:val="22"/>
+          <w:lang w:val="es-ES"/>
+        </w:rPr>
+        <w:t>}</w:t>
+      </w:r>
+    </w:p>
+    <w:p>
+      <w:pPr>
+        <w:spacing w:after="120" w:line="240" w:lineRule="auto"/>
+        <w:rPr>
+          <w:rFonts w:ascii="Palatino Linotype" w:hAnsi="Palatino Linotype" w:cs="Calibri"/>
+          <w:sz w:val="22"/>
+          <w:szCs w:val="22"/>
+          <w:lang w:val="es-ES"/>
+        </w:rPr>
+      </w:pPr>
+      <w:r>
+        <w:rPr>
+          <w:rFonts w:ascii="Palatino Linotype" w:hAnsi="Palatino Linotype" w:cs="Calibri"/>
+          <w:sz w:val="22"/>
+          <w:szCs w:val="22"/>
+          <w:lang w:val="es-ES"/>
+        </w:rPr>
+        <w:t>{#tieneSkills}</w:t>
+      </w:r>
+    </w:p>
+    <w:p>
+      <w:pPr>
         <w:spacing w:after="60"/>
         <w:rPr>
           <w:lang w:val="es-ES"/>
@@ -1077,64 +1539,8 @@
       </w:pPr>
       <w:r>
         <w:rPr>
-          <w:lang w:val="es-ES"/>
-        </w:rPr>
-        <w:t>{/conocimientos}</w:t>
-      </w:r>
-    </w:p>
-    <w:p>
-      <w:pPr>
-        <w:spacing w:after="60"/>
-        <w:rPr>
-          <w:lang w:val="es-ES"/>
-        </w:rPr>
-      </w:pPr>
-      <w:r>
-        <w:rPr>
-          <w:lang w:val="es-ES"/>
-        </w:rPr>
-        <w:t>{/</w:t>
-      </w:r>
-      <w:proofErr w:type="spellStart"/>
-      <w:r>
-        <w:rPr>
-          <w:lang w:val="es-ES"/>
-        </w:rPr>
-        <w:t>tieneConocimientos</w:t>
-      </w:r>
-      <w:proofErr w:type="spellEnd"/>
-      <w:r>
-        <w:rPr>
-          <w:lang w:val="es-ES"/>
-        </w:rPr>
-        <w:t>}</w:t>
-      </w:r>
-    </w:p>
-    <w:p>
-      <w:pPr>
-        <w:spacing w:after="60"/>
-        <w:rPr>
-          <w:lang w:val="es-ES"/>
-        </w:rPr>
-      </w:pPr>
-      <w:r>
-        <w:rPr>
-          <w:lang w:val="es-ES"/>
-        </w:rPr>
-        <w:t>{#tieneSkills}</w:t>
-      </w:r>
-    </w:p>
-    <w:p>
-      <w:pPr>
-        <w:spacing w:after="60"/>
-        <w:rPr>
-          <w:lang w:val="es-ES"/>
-        </w:rPr>
-      </w:pPr>
-      <w:r>
-        <w:rPr>
           <w:noProof/>
-          <w:lang w:val="es-ES"/>
+          <w:lang w:eastAsia="es-MX"/>
         </w:rPr>
         <mc:AlternateContent>
           <mc:Choice Requires="wps">
@@ -1185,7 +1591,7 @@
               </wp:inline>
             </w:drawing>
           </mc:Choice>
-          <mc:Fallback>
+          <mc:Fallback xmlns:cx2="http://schemas.microsoft.com/office/drawing/2015/10/21/chartex" xmlns:cx3="http://schemas.microsoft.com/office/drawing/2016/5/9/chartex" xmlns:cx4="http://schemas.microsoft.com/office/drawing/2016/5/10/chartex" xmlns:cx5="http://schemas.microsoft.com/office/drawing/2016/5/11/chartex" xmlns:cx6="http://schemas.microsoft.com/office/drawing/2016/5/12/chartex" xmlns:cx7="http://schemas.microsoft.com/office/drawing/2016/5/13/chartex" xmlns:cx8="http://schemas.microsoft.com/office/drawing/2016/5/14/chartex" xmlns:aink="http://schemas.microsoft.com/office/drawing/2016/ink" xmlns:am3d="http://schemas.microsoft.com/office/drawing/2017/model3d" xmlns:oel="http://schemas.microsoft.com/office/2019/extlst" xmlns:w16cex="http://schemas.microsoft.com/office/word/2018/wordml/cex" xmlns:w16cid="http://schemas.microsoft.com/office/word/2016/wordml/cid" xmlns:w16="http://schemas.microsoft.com/office/word/2018/wordml" xmlns:w16sdtdh="http://schemas.microsoft.com/office/word/2020/wordml/sdtdatahash">
             <w:pict>
               <v:line w14:anchorId="4971A7A1" id="Conector recto 4" o:spid="_x0000_s1026" style="visibility:visible;mso-wrap-style:square;mso-left-percent:-10001;mso-top-percent:-10001;mso-position-horizontal:absolute;mso-position-horizontal-relative:char;mso-position-vertical:absolute;mso-position-vertical-relative:line;mso-left-percent:-10001;mso-top-percent:-10001" from="0,0" to="235.25pt,0" o:gfxdata="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" strokecolor="#adadad [2414]" strokeweight="1.5pt">
                 <v:stroke joinstyle="miter"/>
@@ -1200,16 +1606,20 @@
       <w:pPr>
         <w:spacing w:before="240" w:after="60"/>
         <w:rPr>
+          <w:rFonts w:ascii="Palatino Linotype" w:hAnsi="Palatino Linotype"/>
           <w:b/>
           <w:bCs/>
+          <w:i/>
           <w:color w:val="0070C0"/>
           <w:lang w:val="es-ES"/>
         </w:rPr>
       </w:pPr>
       <w:r>
         <w:rPr>
+          <w:rFonts w:ascii="Palatino Linotype" w:hAnsi="Palatino Linotype"/>
           <w:b/>
           <w:bCs/>
+          <w:i/>
           <w:color w:val="0070C0"/>
           <w:lang w:val="es-ES"/>
         </w:rPr>
@@ -1218,13 +1628,19 @@
     </w:p>
     <w:p>
       <w:pPr>
-        <w:spacing w:after="60"/>
-        <w:rPr>
-          <w:lang w:val="es-ES"/>
-        </w:rPr>
-      </w:pPr>
-      <w:r>
-        <w:rPr>
+        <w:spacing w:after="120" w:line="240" w:lineRule="auto"/>
+        <w:rPr>
+          <w:rFonts w:ascii="Palatino Linotype" w:hAnsi="Palatino Linotype" w:cs="Calibri"/>
+          <w:sz w:val="22"/>
+          <w:szCs w:val="22"/>
+          <w:lang w:val="es-ES"/>
+        </w:rPr>
+      </w:pPr>
+      <w:r>
+        <w:rPr>
+          <w:rFonts w:ascii="Palatino Linotype" w:hAnsi="Palatino Linotype" w:cs="Calibri"/>
+          <w:sz w:val="22"/>
+          <w:szCs w:val="22"/>
           <w:lang w:val="es-ES"/>
         </w:rPr>
         <w:t>{#habilidades}</w:t>
@@ -1232,19 +1648,28 @@
     </w:p>
     <w:p>
       <w:pPr>
-        <w:spacing w:after="60"/>
-        <w:rPr>
-          <w:lang w:val="es-ES"/>
-        </w:rPr>
-      </w:pPr>
-      <w:r>
-        <w:rPr>
+        <w:spacing w:after="120" w:line="240" w:lineRule="auto"/>
+        <w:rPr>
+          <w:rFonts w:ascii="Palatino Linotype" w:hAnsi="Palatino Linotype" w:cs="Calibri"/>
+          <w:sz w:val="22"/>
+          <w:szCs w:val="22"/>
+          <w:lang w:val="es-ES"/>
+        </w:rPr>
+      </w:pPr>
+      <w:r>
+        <w:rPr>
+          <w:rFonts w:ascii="Palatino Linotype" w:hAnsi="Palatino Linotype" w:cs="Calibri"/>
+          <w:sz w:val="22"/>
+          <w:szCs w:val="22"/>
           <w:lang w:val="es-ES"/>
         </w:rPr>
         <w:t>•</w:t>
       </w:r>
       <w:r>
         <w:rPr>
+          <w:rFonts w:ascii="Palatino Linotype" w:hAnsi="Palatino Linotype" w:cs="Calibri"/>
+          <w:sz w:val="22"/>
+          <w:szCs w:val="22"/>
           <w:lang w:val="es-ES"/>
         </w:rPr>
         <w:tab/>
@@ -1253,6 +1678,9 @@
       <w:proofErr w:type="spellStart"/>
       <w:r>
         <w:rPr>
+          <w:rFonts w:ascii="Palatino Linotype" w:hAnsi="Palatino Linotype" w:cs="Calibri"/>
+          <w:sz w:val="22"/>
+          <w:szCs w:val="22"/>
           <w:lang w:val="es-ES"/>
         </w:rPr>
         <w:t>skill</w:t>
@@ -1260,6 +1688,9 @@
       <w:proofErr w:type="spellEnd"/>
       <w:r>
         <w:rPr>
+          <w:rFonts w:ascii="Palatino Linotype" w:hAnsi="Palatino Linotype" w:cs="Calibri"/>
+          <w:sz w:val="22"/>
+          <w:szCs w:val="22"/>
           <w:lang w:val="es-ES"/>
         </w:rPr>
         <w:t>}</w:t>
@@ -1267,13 +1698,19 @@
     </w:p>
     <w:p>
       <w:pPr>
-        <w:spacing w:after="60"/>
-        <w:rPr>
-          <w:lang w:val="es-ES"/>
-        </w:rPr>
-      </w:pPr>
-      <w:r>
-        <w:rPr>
+        <w:spacing w:after="120" w:line="240" w:lineRule="auto"/>
+        <w:rPr>
+          <w:rFonts w:ascii="Palatino Linotype" w:hAnsi="Palatino Linotype" w:cs="Calibri"/>
+          <w:sz w:val="22"/>
+          <w:szCs w:val="22"/>
+          <w:lang w:val="es-ES"/>
+        </w:rPr>
+      </w:pPr>
+      <w:r>
+        <w:rPr>
+          <w:rFonts w:ascii="Palatino Linotype" w:hAnsi="Palatino Linotype" w:cs="Calibri"/>
+          <w:sz w:val="22"/>
+          <w:szCs w:val="22"/>
           <w:lang w:val="es-ES"/>
         </w:rPr>
         <w:t>{/habilidades}</w:t>
@@ -1281,13 +1718,19 @@
     </w:p>
     <w:p>
       <w:pPr>
-        <w:spacing w:after="60"/>
-        <w:rPr>
-          <w:lang w:val="es-ES"/>
-        </w:rPr>
-      </w:pPr>
-      <w:r>
-        <w:rPr>
+        <w:spacing w:after="120" w:line="240" w:lineRule="auto"/>
+        <w:rPr>
+          <w:rFonts w:ascii="Palatino Linotype" w:hAnsi="Palatino Linotype" w:cs="Calibri"/>
+          <w:sz w:val="22"/>
+          <w:szCs w:val="22"/>
+          <w:lang w:val="es-ES"/>
+        </w:rPr>
+      </w:pPr>
+      <w:r>
+        <w:rPr>
+          <w:rFonts w:ascii="Palatino Linotype" w:hAnsi="Palatino Linotype" w:cs="Calibri"/>
+          <w:sz w:val="22"/>
+          <w:szCs w:val="22"/>
           <w:lang w:val="es-ES"/>
         </w:rPr>
         <w:t>{/</w:t>
@@ -1295,6 +1738,9 @@
       <w:proofErr w:type="spellStart"/>
       <w:r>
         <w:rPr>
+          <w:rFonts w:ascii="Palatino Linotype" w:hAnsi="Palatino Linotype" w:cs="Calibri"/>
+          <w:sz w:val="22"/>
+          <w:szCs w:val="22"/>
           <w:lang w:val="es-ES"/>
         </w:rPr>
         <w:t>tieneSkills</w:t>
@@ -1302,6 +1748,9 @@
       <w:proofErr w:type="spellEnd"/>
       <w:r>
         <w:rPr>
+          <w:rFonts w:ascii="Palatino Linotype" w:hAnsi="Palatino Linotype" w:cs="Calibri"/>
+          <w:sz w:val="22"/>
+          <w:szCs w:val="22"/>
           <w:lang w:val="es-ES"/>
         </w:rPr>
         <w:t>}</w:t>
@@ -1309,151 +1758,15 @@
     </w:p>
     <w:p>
       <w:pPr>
-        <w:spacing w:after="60"/>
-        <w:rPr>
-          <w:lang w:val="es-ES"/>
-        </w:rPr>
-      </w:pPr>
-      <w:r>
-        <w:rPr>
-          <w:lang w:val="es-ES"/>
-        </w:rPr>
-        <w:t>{#tieneComentarios}</w:t>
-      </w:r>
-    </w:p>
-    <w:p>
-      <w:pPr>
-        <w:spacing w:after="60"/>
-        <w:rPr>
-          <w:lang w:val="es-ES"/>
-        </w:rPr>
-      </w:pPr>
-      <w:r>
-        <w:rPr>
-          <w:noProof/>
-          <w:lang w:val="es-ES"/>
-        </w:rPr>
-        <mc:AlternateContent>
-          <mc:Choice Requires="wps">
-            <w:drawing>
-              <wp:inline distT="0" distB="0" distL="0" distR="0" wp14:anchorId="5617CC6E" wp14:editId="0CF3148C">
-                <wp:extent cx="2987675" cy="0"/>
-                <wp:effectExtent l="0" t="0" r="0" b="0"/>
-                <wp:docPr id="5" name="Conector recto 5"/>
-                <wp:cNvGraphicFramePr/>
-                <a:graphic xmlns:a="http://schemas.openxmlformats.org/drawingml/2006/main">
-                  <a:graphicData uri="http://schemas.microsoft.com/office/word/2010/wordprocessingShape">
-                    <wps:wsp>
-                      <wps:cNvCnPr/>
-                      <wps:spPr>
-                        <a:xfrm>
-                          <a:off x="0" y="0"/>
-                          <a:ext cx="2987675" cy="0"/>
-                        </a:xfrm>
-                        <a:prstGeom prst="line">
-                          <a:avLst/>
-                        </a:prstGeom>
-                        <a:ln w="19050">
-                          <a:solidFill>
-                            <a:schemeClr val="bg2">
-                              <a:lumMod val="75000"/>
-                            </a:schemeClr>
-                          </a:solidFill>
-                        </a:ln>
-                      </wps:spPr>
-                      <wps:style>
-                        <a:lnRef idx="1">
-                          <a:schemeClr val="accent1"/>
-                        </a:lnRef>
-                        <a:fillRef idx="0">
-                          <a:schemeClr val="accent1"/>
-                        </a:fillRef>
-                        <a:effectRef idx="0">
-                          <a:schemeClr val="accent1"/>
-                        </a:effectRef>
-                        <a:fontRef idx="minor">
-                          <a:schemeClr val="tx1"/>
-                        </a:fontRef>
-                      </wps:style>
-                      <wps:bodyPr/>
-                    </wps:wsp>
-                  </a:graphicData>
-                </a:graphic>
-              </wp:inline>
-            </w:drawing>
-          </mc:Choice>
-          <mc:Fallback>
-            <w:pict>
-              <v:line w14:anchorId="1B8EBCB3" id="Conector recto 5" o:spid="_x0000_s1026" style="visibility:visible;mso-wrap-style:square;mso-left-percent:-10001;mso-top-percent:-10001;mso-position-horizontal:absolute;mso-position-horizontal-relative:char;mso-position-vertical:absolute;mso-position-vertical-relative:line;mso-left-percent:-10001;mso-top-percent:-10001" from="0,0" to="235.25pt,0" o:gfxdata="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" strokecolor="#adadad [2414]" strokeweight="1.5pt">
-                <v:stroke joinstyle="miter"/>
-                <w10:anchorlock/>
-              </v:line>
-            </w:pict>
-          </mc:Fallback>
-        </mc:AlternateContent>
-      </w:r>
-    </w:p>
-    <w:p>
-      <w:pPr>
-        <w:spacing w:before="240" w:after="60"/>
-        <w:rPr>
-          <w:b/>
-          <w:bCs/>
-          <w:color w:val="0070C0"/>
-          <w:lang w:val="es-ES"/>
-        </w:rPr>
-      </w:pPr>
-      <w:r>
-        <w:rPr>
-          <w:b/>
-          <w:bCs/>
-          <w:color w:val="0070C0"/>
-          <w:lang w:val="es-ES"/>
-        </w:rPr>
-        <w:t>NOTAS O COMENTARIOS</w:t>
-      </w:r>
-    </w:p>
-    <w:p>
-      <w:pPr>
-        <w:spacing w:after="60"/>
-        <w:rPr>
-          <w:lang w:val="es-ES"/>
-        </w:rPr>
-      </w:pPr>
-      <w:r>
-        <w:rPr>
-          <w:lang w:val="es-ES"/>
-        </w:rPr>
-        <w:t>{comentarios}</w:t>
-      </w:r>
-    </w:p>
-    <w:p>
-      <w:pPr>
-        <w:spacing w:after="60"/>
-        <w:rPr>
-          <w:lang w:val="es-ES"/>
-        </w:rPr>
-      </w:pPr>
-      <w:r>
-        <w:rPr>
-          <w:lang w:val="es-ES"/>
-        </w:rPr>
-        <w:t>{/</w:t>
-      </w:r>
-      <w:proofErr w:type="spellStart"/>
-      <w:r>
-        <w:rPr>
-          <w:lang w:val="es-ES"/>
-        </w:rPr>
-        <w:t>tieneComentarios</w:t>
-      </w:r>
-      <w:proofErr w:type="spellEnd"/>
-      <w:r>
-        <w:rPr>
-          <w:lang w:val="es-ES"/>
-        </w:rPr>
-        <w:t>}</w:t>
-      </w:r>
+        <w:spacing w:after="120" w:line="240" w:lineRule="auto"/>
+        <w:rPr>
+          <w:rFonts w:ascii="Palatino Linotype" w:hAnsi="Palatino Linotype" w:cs="Calibri"/>
+          <w:sz w:val="22"/>
+          <w:szCs w:val="22"/>
+          <w:u w:val="single"/>
+          <w:lang w:val="es-ES"/>
+        </w:rPr>
+      </w:pPr>
     </w:p>
     <w:sectPr>
       <w:type w:val="continuous"/>
@@ -1467,7 +1780,7 @@
 </file>
 
 <file path=word/endnotes.xml><?xml version="1.0" encoding="utf-8"?>
-<w:endnotes xmlns:wpc="http://schemas.microsoft.com/office/word/2010/wordprocessingCanvas" xmlns:cx="http://schemas.microsoft.com/office/drawing/2014/chartex" xmlns:cx1="http://schemas.microsoft.com/office/drawing/2015/9/8/chartex" xmlns:cx2="http://schemas.microsoft.com/office/drawing/2015/10/21/chartex" xmlns:cx3="http://schemas.microsoft.com/office/drawing/2016/5/9/chartex" xmlns:cx4="http://schemas.microsoft.com/office/drawing/2016/5/10/chartex" xmlns:cx5="http://schemas.microsoft.com/office/drawing/2016/5/11/chartex" xmlns:cx6="http://schemas.microsoft.com/office/drawing/2016/5/12/chartex" xmlns:cx7="http://schemas.microsoft.com/office/drawing/2016/5/13/chartex" xmlns:cx8="http://schemas.microsoft.com/office/drawing/2016/5/14/chartex" xmlns:mc="http://schemas.openxmlformats.org/markup-compatibility/2006" xmlns:aink="http://schemas.microsoft.com/office/drawing/2016/ink" xmlns:am3d="http://schemas.microsoft.com/office/drawing/2017/model3d" xmlns:o="urn:schemas-microsoft-com:office:office" xmlns:oel="http://schemas.microsoft.com/office/2019/extlst" xmlns:r="http://schemas.openxmlformats.org/officeDocument/2006/relationships" xmlns:m="http://schemas.openxmlformats.org/officeDocument/2006/math" xmlns:v="urn:schemas-microsoft-com:vml" xmlns:wp14="http://schemas.microsoft.com/office/word/2010/wordprocessingDrawing" xmlns:wp="http://schemas.openxmlformats.org/drawingml/2006/wordprocessingDrawing" xmlns:w10="urn:schemas-microsoft-com:office:word" xmlns:w="http://schemas.openxmlformats.org/wordprocessingml/2006/main" xmlns:w14="http://schemas.microsoft.com/office/word/2010/wordml" xmlns:w15="http://schemas.microsoft.com/office/word/2012/wordml" xmlns:w16cex="http://schemas.microsoft.com/office/word/2018/wordml/cex" xmlns:w16cid="http://schemas.microsoft.com/office/word/2016/wordml/cid" xmlns:w16="http://schemas.microsoft.com/office/word/2018/wordml" xmlns:w16sdtdh="http://schemas.microsoft.com/office/word/2020/wordml/sdtdatahash" xmlns:w16se="http://schemas.microsoft.com/office/word/2015/wordml/symex" xmlns:wpg="http://schemas.microsoft.com/office/word/2010/wordprocessingGroup" xmlns:wpi="http://schemas.microsoft.com/office/word/2010/wordprocessingInk" xmlns:wne="http://schemas.microsoft.com/office/word/2006/wordml" xmlns:wps="http://schemas.microsoft.com/office/word/2010/wordprocessingShape" mc:Ignorable="w14 w15 w16se w16cid w16 w16cex w16sdtdh wp14">
+<w:endnotes xmlns:wpc="http://schemas.microsoft.com/office/word/2010/wordprocessingCanvas" xmlns:cx="http://schemas.microsoft.com/office/drawing/2014/chartex" xmlns:cx1="http://schemas.microsoft.com/office/drawing/2015/9/8/chartex" xmlns:mc="http://schemas.openxmlformats.org/markup-compatibility/2006" xmlns:o="urn:schemas-microsoft-com:office:office" xmlns:r="http://schemas.openxmlformats.org/officeDocument/2006/relationships" xmlns:m="http://schemas.openxmlformats.org/officeDocument/2006/math" xmlns:v="urn:schemas-microsoft-com:vml" xmlns:wp14="http://schemas.microsoft.com/office/word/2010/wordprocessingDrawing" xmlns:wp="http://schemas.openxmlformats.org/drawingml/2006/wordprocessingDrawing" xmlns:w10="urn:schemas-microsoft-com:office:word" xmlns:w="http://schemas.openxmlformats.org/wordprocessingml/2006/main" xmlns:w14="http://schemas.microsoft.com/office/word/2010/wordml" xmlns:w15="http://schemas.microsoft.com/office/word/2012/wordml" xmlns:w16se="http://schemas.microsoft.com/office/word/2015/wordml/symex" xmlns:wpg="http://schemas.microsoft.com/office/word/2010/wordprocessingGroup" xmlns:wpi="http://schemas.microsoft.com/office/word/2010/wordprocessingInk" xmlns:wne="http://schemas.microsoft.com/office/word/2006/wordml" xmlns:wps="http://schemas.microsoft.com/office/word/2010/wordprocessingShape" mc:Ignorable="w14 w15 w16se wp14">
   <w:endnote w:type="separator" w:id="-1">
     <w:p>
       <w:pPr>
@@ -1492,7 +1805,7 @@
 </file>
 
 <file path=word/footer1.xml><?xml version="1.0" encoding="utf-8"?>
-<w:ftr xmlns:wpc="http://schemas.microsoft.com/office/word/2010/wordprocessingCanvas" xmlns:cx="http://schemas.microsoft.com/office/drawing/2014/chartex" xmlns:cx1="http://schemas.microsoft.com/office/drawing/2015/9/8/chartex" xmlns:cx2="http://schemas.microsoft.com/office/drawing/2015/10/21/chartex" xmlns:cx3="http://schemas.microsoft.com/office/drawing/2016/5/9/chartex" xmlns:cx4="http://schemas.microsoft.com/office/drawing/2016/5/10/chartex" xmlns:cx5="http://schemas.microsoft.com/office/drawing/2016/5/11/chartex" xmlns:cx6="http://schemas.microsoft.com/office/drawing/2016/5/12/chartex" xmlns:cx7="http://schemas.microsoft.com/office/drawing/2016/5/13/chartex" xmlns:cx8="http://schemas.microsoft.com/office/drawing/2016/5/14/chartex" xmlns:mc="http://schemas.openxmlformats.org/markup-compatibility/2006" xmlns:aink="http://schemas.microsoft.com/office/drawing/2016/ink" xmlns:am3d="http://schemas.microsoft.com/office/drawing/2017/model3d" xmlns:o="urn:schemas-microsoft-com:office:office" xmlns:oel="http://schemas.microsoft.com/office/2019/extlst" xmlns:r="http://schemas.openxmlformats.org/officeDocument/2006/relationships" xmlns:m="http://schemas.openxmlformats.org/officeDocument/2006/math" xmlns:v="urn:schemas-microsoft-com:vml" xmlns:wp14="http://schemas.microsoft.com/office/word/2010/wordprocessingDrawing" xmlns:wp="http://schemas.openxmlformats.org/drawingml/2006/wordprocessingDrawing" xmlns:w10="urn:schemas-microsoft-com:office:word" xmlns:w="http://schemas.openxmlformats.org/wordprocessingml/2006/main" xmlns:w14="http://schemas.microsoft.com/office/word/2010/wordml" xmlns:w15="http://schemas.microsoft.com/office/word/2012/wordml" xmlns:w16cex="http://schemas.microsoft.com/office/word/2018/wordml/cex" xmlns:w16cid="http://schemas.microsoft.com/office/word/2016/wordml/cid" xmlns:w16="http://schemas.microsoft.com/office/word/2018/wordml" xmlns:w16sdtdh="http://schemas.microsoft.com/office/word/2020/wordml/sdtdatahash" xmlns:w16se="http://schemas.microsoft.com/office/word/2015/wordml/symex" xmlns:wpg="http://schemas.microsoft.com/office/word/2010/wordprocessingGroup" xmlns:wpi="http://schemas.microsoft.com/office/word/2010/wordprocessingInk" xmlns:wne="http://schemas.microsoft.com/office/word/2006/wordml" xmlns:wps="http://schemas.microsoft.com/office/word/2010/wordprocessingShape" mc:Ignorable="w14 w15 w16se w16cid w16 w16cex w16sdtdh wp14">
+<w:ftr xmlns:wpc="http://schemas.microsoft.com/office/word/2010/wordprocessingCanvas" xmlns:cx="http://schemas.microsoft.com/office/drawing/2014/chartex" xmlns:cx1="http://schemas.microsoft.com/office/drawing/2015/9/8/chartex" xmlns:mc="http://schemas.openxmlformats.org/markup-compatibility/2006" xmlns:o="urn:schemas-microsoft-com:office:office" xmlns:r="http://schemas.openxmlformats.org/officeDocument/2006/relationships" xmlns:m="http://schemas.openxmlformats.org/officeDocument/2006/math" xmlns:v="urn:schemas-microsoft-com:vml" xmlns:wp14="http://schemas.microsoft.com/office/word/2010/wordprocessingDrawing" xmlns:wp="http://schemas.openxmlformats.org/drawingml/2006/wordprocessingDrawing" xmlns:w10="urn:schemas-microsoft-com:office:word" xmlns:w="http://schemas.openxmlformats.org/wordprocessingml/2006/main" xmlns:w14="http://schemas.microsoft.com/office/word/2010/wordml" xmlns:w15="http://schemas.microsoft.com/office/word/2012/wordml" xmlns:w16se="http://schemas.microsoft.com/office/word/2015/wordml/symex" xmlns:wpg="http://schemas.microsoft.com/office/word/2010/wordprocessingGroup" xmlns:wpi="http://schemas.microsoft.com/office/word/2010/wordprocessingInk" xmlns:wne="http://schemas.microsoft.com/office/word/2006/wordml" xmlns:wps="http://schemas.microsoft.com/office/word/2010/wordprocessingShape" mc:Ignorable="w14 w15 w16se wp14">
   <w:p>
     <w:pPr>
       <w:pStyle w:val="Piedepgina"/>
@@ -1502,7 +1815,7 @@
 </file>
 
 <file path=word/footnotes.xml><?xml version="1.0" encoding="utf-8"?>
-<w:footnotes xmlns:wpc="http://schemas.microsoft.com/office/word/2010/wordprocessingCanvas" xmlns:cx="http://schemas.microsoft.com/office/drawing/2014/chartex" xmlns:cx1="http://schemas.microsoft.com/office/drawing/2015/9/8/chartex" xmlns:cx2="http://schemas.microsoft.com/office/drawing/2015/10/21/chartex" xmlns:cx3="http://schemas.microsoft.com/office/drawing/2016/5/9/chartex" xmlns:cx4="http://schemas.microsoft.com/office/drawing/2016/5/10/chartex" xmlns:cx5="http://schemas.microsoft.com/office/drawing/2016/5/11/chartex" xmlns:cx6="http://schemas.microsoft.com/office/drawing/2016/5/12/chartex" xmlns:cx7="http://schemas.microsoft.com/office/drawing/2016/5/13/chartex" xmlns:cx8="http://schemas.microsoft.com/office/drawing/2016/5/14/chartex" xmlns:mc="http://schemas.openxmlformats.org/markup-compatibility/2006" xmlns:aink="http://schemas.microsoft.com/office/drawing/2016/ink" xmlns:am3d="http://schemas.microsoft.com/office/drawing/2017/model3d" xmlns:o="urn:schemas-microsoft-com:office:office" xmlns:oel="http://schemas.microsoft.com/office/2019/extlst" xmlns:r="http://schemas.openxmlformats.org/officeDocument/2006/relationships" xmlns:m="http://schemas.openxmlformats.org/officeDocument/2006/math" xmlns:v="urn:schemas-microsoft-com:vml" xmlns:wp14="http://schemas.microsoft.com/office/word/2010/wordprocessingDrawing" xmlns:wp="http://schemas.openxmlformats.org/drawingml/2006/wordprocessingDrawing" xmlns:w10="urn:schemas-microsoft-com:office:word" xmlns:w="http://schemas.openxmlformats.org/wordprocessingml/2006/main" xmlns:w14="http://schemas.microsoft.com/office/word/2010/wordml" xmlns:w15="http://schemas.microsoft.com/office/word/2012/wordml" xmlns:w16cex="http://schemas.microsoft.com/office/word/2018/wordml/cex" xmlns:w16cid="http://schemas.microsoft.com/office/word/2016/wordml/cid" xmlns:w16="http://schemas.microsoft.com/office/word/2018/wordml" xmlns:w16sdtdh="http://schemas.microsoft.com/office/word/2020/wordml/sdtdatahash" xmlns:w16se="http://schemas.microsoft.com/office/word/2015/wordml/symex" xmlns:wpg="http://schemas.microsoft.com/office/word/2010/wordprocessingGroup" xmlns:wpi="http://schemas.microsoft.com/office/word/2010/wordprocessingInk" xmlns:wne="http://schemas.microsoft.com/office/word/2006/wordml" xmlns:wps="http://schemas.microsoft.com/office/word/2010/wordprocessingShape" mc:Ignorable="w14 w15 w16se w16cid w16 w16cex w16sdtdh wp14">
+<w:footnotes xmlns:wpc="http://schemas.microsoft.com/office/word/2010/wordprocessingCanvas" xmlns:cx="http://schemas.microsoft.com/office/drawing/2014/chartex" xmlns:cx1="http://schemas.microsoft.com/office/drawing/2015/9/8/chartex" xmlns:mc="http://schemas.openxmlformats.org/markup-compatibility/2006" xmlns:o="urn:schemas-microsoft-com:office:office" xmlns:r="http://schemas.openxmlformats.org/officeDocument/2006/relationships" xmlns:m="http://schemas.openxmlformats.org/officeDocument/2006/math" xmlns:v="urn:schemas-microsoft-com:vml" xmlns:wp14="http://schemas.microsoft.com/office/word/2010/wordprocessingDrawing" xmlns:wp="http://schemas.openxmlformats.org/drawingml/2006/wordprocessingDrawing" xmlns:w10="urn:schemas-microsoft-com:office:word" xmlns:w="http://schemas.openxmlformats.org/wordprocessingml/2006/main" xmlns:w14="http://schemas.microsoft.com/office/word/2010/wordml" xmlns:w15="http://schemas.microsoft.com/office/word/2012/wordml" xmlns:w16se="http://schemas.microsoft.com/office/word/2015/wordml/symex" xmlns:wpg="http://schemas.microsoft.com/office/word/2010/wordprocessingGroup" xmlns:wpi="http://schemas.microsoft.com/office/word/2010/wordprocessingInk" xmlns:wne="http://schemas.microsoft.com/office/word/2006/wordml" xmlns:wps="http://schemas.microsoft.com/office/word/2010/wordprocessingShape" mc:Ignorable="w14 w15 w16se wp14">
   <w:footnote w:type="separator" w:id="-1">
     <w:p>
       <w:pPr>
@@ -1527,7 +1840,7 @@
 </file>
 
 <file path=word/header1.xml><?xml version="1.0" encoding="utf-8"?>
-<w:hdr xmlns:wpc="http://schemas.microsoft.com/office/word/2010/wordprocessingCanvas" xmlns:cx="http://schemas.microsoft.com/office/drawing/2014/chartex" xmlns:cx1="http://schemas.microsoft.com/office/drawing/2015/9/8/chartex" xmlns:cx2="http://schemas.microsoft.com/office/drawing/2015/10/21/chartex" xmlns:cx3="http://schemas.microsoft.com/office/drawing/2016/5/9/chartex" xmlns:cx4="http://schemas.microsoft.com/office/drawing/2016/5/10/chartex" xmlns:cx5="http://schemas.microsoft.com/office/drawing/2016/5/11/chartex" xmlns:cx6="http://schemas.microsoft.com/office/drawing/2016/5/12/chartex" xmlns:cx7="http://schemas.microsoft.com/office/drawing/2016/5/13/chartex" xmlns:cx8="http://schemas.microsoft.com/office/drawing/2016/5/14/chartex" xmlns:mc="http://schemas.openxmlformats.org/markup-compatibility/2006" xmlns:aink="http://schemas.microsoft.com/office/drawing/2016/ink" xmlns:am3d="http://schemas.microsoft.com/office/drawing/2017/model3d" xmlns:o="urn:schemas-microsoft-com:office:office" xmlns:oel="http://schemas.microsoft.com/office/2019/extlst" xmlns:r="http://schemas.openxmlformats.org/officeDocument/2006/relationships" xmlns:m="http://schemas.openxmlformats.org/officeDocument/2006/math" xmlns:v="urn:schemas-microsoft-com:vml" xmlns:wp14="http://schemas.microsoft.com/office/word/2010/wordprocessingDrawing" xmlns:wp="http://schemas.openxmlformats.org/drawingml/2006/wordprocessingDrawing" xmlns:w10="urn:schemas-microsoft-com:office:word" xmlns:w="http://schemas.openxmlformats.org/wordprocessingml/2006/main" xmlns:w14="http://schemas.microsoft.com/office/word/2010/wordml" xmlns:w15="http://schemas.microsoft.com/office/word/2012/wordml" xmlns:w16cex="http://schemas.microsoft.com/office/word/2018/wordml/cex" xmlns:w16cid="http://schemas.microsoft.com/office/word/2016/wordml/cid" xmlns:w16="http://schemas.microsoft.com/office/word/2018/wordml" xmlns:w16sdtdh="http://schemas.microsoft.com/office/word/2020/wordml/sdtdatahash" xmlns:w16se="http://schemas.microsoft.com/office/word/2015/wordml/symex" xmlns:wpg="http://schemas.microsoft.com/office/word/2010/wordprocessingGroup" xmlns:wpi="http://schemas.microsoft.com/office/word/2010/wordprocessingInk" xmlns:wne="http://schemas.microsoft.com/office/word/2006/wordml" xmlns:wps="http://schemas.microsoft.com/office/word/2010/wordprocessingShape" mc:Ignorable="w14 w15 w16se w16cid w16 w16cex w16sdtdh wp14">
+<w:hdr xmlns:wpc="http://schemas.microsoft.com/office/word/2010/wordprocessingCanvas" xmlns:cx="http://schemas.microsoft.com/office/drawing/2014/chartex" xmlns:cx1="http://schemas.microsoft.com/office/drawing/2015/9/8/chartex" xmlns:mc="http://schemas.openxmlformats.org/markup-compatibility/2006" xmlns:o="urn:schemas-microsoft-com:office:office" xmlns:r="http://schemas.openxmlformats.org/officeDocument/2006/relationships" xmlns:m="http://schemas.openxmlformats.org/officeDocument/2006/math" xmlns:v="urn:schemas-microsoft-com:vml" xmlns:wp14="http://schemas.microsoft.com/office/word/2010/wordprocessingDrawing" xmlns:wp="http://schemas.openxmlformats.org/drawingml/2006/wordprocessingDrawing" xmlns:w10="urn:schemas-microsoft-com:office:word" xmlns:w="http://schemas.openxmlformats.org/wordprocessingml/2006/main" xmlns:w14="http://schemas.microsoft.com/office/word/2010/wordml" xmlns:w15="http://schemas.microsoft.com/office/word/2012/wordml" xmlns:w16se="http://schemas.microsoft.com/office/word/2015/wordml/symex" xmlns:wpg="http://schemas.microsoft.com/office/word/2010/wordprocessingGroup" xmlns:wpi="http://schemas.microsoft.com/office/word/2010/wordprocessingInk" xmlns:wne="http://schemas.microsoft.com/office/word/2006/wordml" xmlns:wps="http://schemas.microsoft.com/office/word/2010/wordprocessingShape" mc:Ignorable="w14 w15 w16se wp14">
   <w:p>
     <w:pPr>
       <w:pStyle w:val="Encabezado"/>
@@ -1537,7 +1850,7 @@
 </file>
 
 <file path=word/numbering.xml><?xml version="1.0" encoding="utf-8"?>
-<w:numbering xmlns:wpc="http://schemas.microsoft.com/office/word/2010/wordprocessingCanvas" xmlns:cx="http://schemas.microsoft.com/office/drawing/2014/chartex" xmlns:cx1="http://schemas.microsoft.com/office/drawing/2015/9/8/chartex" xmlns:cx2="http://schemas.microsoft.com/office/drawing/2015/10/21/chartex" xmlns:cx3="http://schemas.microsoft.com/office/drawing/2016/5/9/chartex" xmlns:cx4="http://schemas.microsoft.com/office/drawing/2016/5/10/chartex" xmlns:cx5="http://schemas.microsoft.com/office/drawing/2016/5/11/chartex" xmlns:cx6="http://schemas.microsoft.com/office/drawing/2016/5/12/chartex" xmlns:cx7="http://schemas.microsoft.com/office/drawing/2016/5/13/chartex" xmlns:cx8="http://schemas.microsoft.com/office/drawing/2016/5/14/chartex" xmlns:mc="http://schemas.openxmlformats.org/markup-compatibility/2006" xmlns:aink="http://schemas.microsoft.com/office/drawing/2016/ink" xmlns:am3d="http://schemas.microsoft.com/office/drawing/2017/model3d" xmlns:o="urn:schemas-microsoft-com:office:office" xmlns:oel="http://schemas.microsoft.com/office/2019/extlst" xmlns:r="http://schemas.openxmlformats.org/officeDocument/2006/relationships" xmlns:m="http://schemas.openxmlformats.org/officeDocument/2006/math" xmlns:v="urn:schemas-microsoft-com:vml" xmlns:wp14="http://schemas.microsoft.com/office/word/2010/wordprocessingDrawing" xmlns:wp="http://schemas.openxmlformats.org/drawingml/2006/wordprocessingDrawing" xmlns:w10="urn:schemas-microsoft-com:office:word" xmlns:w="http://schemas.openxmlformats.org/wordprocessingml/2006/main" xmlns:w14="http://schemas.microsoft.com/office/word/2010/wordml" xmlns:w15="http://schemas.microsoft.com/office/word/2012/wordml" xmlns:w16cex="http://schemas.microsoft.com/office/word/2018/wordml/cex" xmlns:w16cid="http://schemas.microsoft.com/office/word/2016/wordml/cid" xmlns:w16="http://schemas.microsoft.com/office/word/2018/wordml" xmlns:w16sdtdh="http://schemas.microsoft.com/office/word/2020/wordml/sdtdatahash" xmlns:w16se="http://schemas.microsoft.com/office/word/2015/wordml/symex" xmlns:wpg="http://schemas.microsoft.com/office/word/2010/wordprocessingGroup" xmlns:wpi="http://schemas.microsoft.com/office/word/2010/wordprocessingInk" xmlns:wne="http://schemas.microsoft.com/office/word/2006/wordml" xmlns:wps="http://schemas.microsoft.com/office/word/2010/wordprocessingShape" mc:Ignorable="w14 w15 w16se w16cid w16 w16cex w16sdtdh wp14">
+<w:numbering xmlns:wpc="http://schemas.microsoft.com/office/word/2010/wordprocessingCanvas" xmlns:cx="http://schemas.microsoft.com/office/drawing/2014/chartex" xmlns:cx1="http://schemas.microsoft.com/office/drawing/2015/9/8/chartex" xmlns:mc="http://schemas.openxmlformats.org/markup-compatibility/2006" xmlns:o="urn:schemas-microsoft-com:office:office" xmlns:r="http://schemas.openxmlformats.org/officeDocument/2006/relationships" xmlns:m="http://schemas.openxmlformats.org/officeDocument/2006/math" xmlns:v="urn:schemas-microsoft-com:vml" xmlns:wp14="http://schemas.microsoft.com/office/word/2010/wordprocessingDrawing" xmlns:wp="http://schemas.openxmlformats.org/drawingml/2006/wordprocessingDrawing" xmlns:w10="urn:schemas-microsoft-com:office:word" xmlns:w="http://schemas.openxmlformats.org/wordprocessingml/2006/main" xmlns:w14="http://schemas.microsoft.com/office/word/2010/wordml" xmlns:w15="http://schemas.microsoft.com/office/word/2012/wordml" xmlns:w16se="http://schemas.microsoft.com/office/word/2015/wordml/symex" xmlns:wpg="http://schemas.microsoft.com/office/word/2010/wordprocessingGroup" xmlns:wpi="http://schemas.microsoft.com/office/word/2010/wordprocessingInk" xmlns:wne="http://schemas.microsoft.com/office/word/2006/wordml" xmlns:wps="http://schemas.microsoft.com/office/word/2010/wordprocessingShape" mc:Ignorable="w14 w15 w16se wp14">
   <w:abstractNum w:abstractNumId="0" w15:restartNumberingAfterBreak="0">
     <w:nsid w:val="5FCA1C0B"/>
     <w:multiLevelType w:val="hybridMultilevel"/>
@@ -1651,14 +1964,14 @@
       </w:rPr>
     </w:lvl>
   </w:abstractNum>
-  <w:num w:numId="1" w16cid:durableId="29886836">
+  <w:num w:numId="1">
     <w:abstractNumId w:val="0"/>
   </w:num>
 </w:numbering>
 </file>
 
 <file path=word/styles.xml><?xml version="1.0" encoding="utf-8"?>
-<w:styles xmlns:mc="http://schemas.openxmlformats.org/markup-compatibility/2006" xmlns:r="http://schemas.openxmlformats.org/officeDocument/2006/relationships" xmlns:w="http://schemas.openxmlformats.org/wordprocessingml/2006/main" xmlns:w14="http://schemas.microsoft.com/office/word/2010/wordml" xmlns:w15="http://schemas.microsoft.com/office/word/2012/wordml" xmlns:w16cex="http://schemas.microsoft.com/office/word/2018/wordml/cex" xmlns:w16cid="http://schemas.microsoft.com/office/word/2016/wordml/cid" xmlns:w16="http://schemas.microsoft.com/office/word/2018/wordml" xmlns:w16sdtdh="http://schemas.microsoft.com/office/word/2020/wordml/sdtdatahash" xmlns:w16se="http://schemas.microsoft.com/office/word/2015/wordml/symex" mc:Ignorable="w14 w15 w16se w16cid w16 w16cex w16sdtdh">
+<w:styles xmlns:mc="http://schemas.openxmlformats.org/markup-compatibility/2006" xmlns:r="http://schemas.openxmlformats.org/officeDocument/2006/relationships" xmlns:w="http://schemas.openxmlformats.org/wordprocessingml/2006/main" xmlns:w14="http://schemas.microsoft.com/office/word/2010/wordml" xmlns:w15="http://schemas.microsoft.com/office/word/2012/wordml" xmlns:w16se="http://schemas.microsoft.com/office/word/2015/wordml/symex" mc:Ignorable="w14 w15 w16se">
   <w:docDefaults>
     <w:rPrDefault>
       <w:rPr>
@@ -1676,7 +1989,7 @@
       </w:pPr>
     </w:pPrDefault>
   </w:docDefaults>
-  <w:latentStyles w:defLockedState="0" w:defUIPriority="99" w:defSemiHidden="0" w:defUnhideWhenUsed="0" w:defQFormat="0" w:count="376">
+  <w:latentStyles w:defLockedState="0" w:defUIPriority="99" w:defSemiHidden="0" w:defUnhideWhenUsed="0" w:defQFormat="0" w:count="371">
     <w:lsdException w:name="Normal" w:uiPriority="0" w:qFormat="1"/>
     <w:lsdException w:name="heading 1" w:uiPriority="9" w:qFormat="1"/>
     <w:lsdException w:name="heading 2" w:semiHidden="1" w:uiPriority="9" w:unhideWhenUsed="1" w:qFormat="1"/>
@@ -2048,11 +2361,6 @@
     <w:lsdException w:name="List Table 5 Dark Accent 6" w:uiPriority="50"/>
     <w:lsdException w:name="List Table 6 Colorful Accent 6" w:uiPriority="51"/>
     <w:lsdException w:name="List Table 7 Colorful Accent 6" w:uiPriority="52"/>
-    <w:lsdException w:name="Mention" w:semiHidden="1" w:unhideWhenUsed="1"/>
-    <w:lsdException w:name="Smart Hyperlink" w:semiHidden="1" w:unhideWhenUsed="1"/>
-    <w:lsdException w:name="Hashtag" w:semiHidden="1" w:unhideWhenUsed="1"/>
-    <w:lsdException w:name="Unresolved Mention" w:semiHidden="1" w:unhideWhenUsed="1"/>
-    <w:lsdException w:name="Smart Link" w:semiHidden="1" w:unhideWhenUsed="1"/>
   </w:latentStyles>
   <w:style w:type="paragraph" w:default="1" w:styleId="Normal">
     <w:name w:val="Normal"/>

</xml_diff>

<commit_message>
se agrego formato 1 al documento de ingles de una columna y dos
</commit_message>
<xml_diff>
--- a/src/assets/PlantillaDos.docx
+++ b/src/assets/PlantillaDos.docx
@@ -567,14 +567,17 @@
         <w:spacing w:after="0"/>
         <w:rPr>
           <w:rFonts w:ascii="Palatino Linotype" w:hAnsi="Palatino Linotype" w:cs="Calibri"/>
-          <w:sz w:val="22"/>
-          <w:szCs w:val="22"/>
-          <w:lang w:val="es-ES"/>
-        </w:rPr>
-      </w:pPr>
-      <w:r>
-        <w:rPr>
-          <w:rFonts w:ascii="Palatino Linotype" w:hAnsi="Palatino Linotype" w:cs="Calibri"/>
+          <w:b/>
+          <w:sz w:val="22"/>
+          <w:szCs w:val="22"/>
+          <w:lang w:val="es-ES"/>
+        </w:rPr>
+      </w:pPr>
+      <w:bookmarkStart w:id="0" w:name="_GoBack"/>
+      <w:r>
+        <w:rPr>
+          <w:rFonts w:ascii="Palatino Linotype" w:hAnsi="Palatino Linotype" w:cs="Calibri"/>
+          <w:b/>
           <w:sz w:val="22"/>
           <w:szCs w:val="22"/>
           <w:lang w:val="es-ES"/>
@@ -587,14 +590,16 @@
         <w:spacing w:after="0"/>
         <w:rPr>
           <w:rFonts w:ascii="Palatino Linotype" w:hAnsi="Palatino Linotype" w:cs="Calibri"/>
-          <w:sz w:val="22"/>
-          <w:szCs w:val="22"/>
-          <w:lang w:val="es-ES"/>
-        </w:rPr>
-      </w:pPr>
-      <w:r>
-        <w:rPr>
-          <w:rFonts w:ascii="Palatino Linotype" w:hAnsi="Palatino Linotype" w:cs="Calibri"/>
+          <w:b/>
+          <w:sz w:val="22"/>
+          <w:szCs w:val="22"/>
+          <w:lang w:val="es-ES"/>
+        </w:rPr>
+      </w:pPr>
+      <w:r>
+        <w:rPr>
+          <w:rFonts w:ascii="Palatino Linotype" w:hAnsi="Palatino Linotype" w:cs="Calibri"/>
+          <w:b/>
           <w:sz w:val="22"/>
           <w:szCs w:val="22"/>
           <w:lang w:val="es-ES"/>
@@ -607,14 +612,16 @@
         <w:spacing w:after="0"/>
         <w:rPr>
           <w:rFonts w:ascii="Palatino Linotype" w:hAnsi="Palatino Linotype" w:cs="Calibri"/>
-          <w:sz w:val="22"/>
-          <w:szCs w:val="22"/>
-          <w:lang w:val="es-ES"/>
-        </w:rPr>
-      </w:pPr>
-      <w:r>
-        <w:rPr>
-          <w:rFonts w:ascii="Palatino Linotype" w:hAnsi="Palatino Linotype" w:cs="Calibri"/>
+          <w:b/>
+          <w:sz w:val="22"/>
+          <w:szCs w:val="22"/>
+          <w:lang w:val="es-ES"/>
+        </w:rPr>
+      </w:pPr>
+      <w:r>
+        <w:rPr>
+          <w:rFonts w:ascii="Palatino Linotype" w:hAnsi="Palatino Linotype" w:cs="Calibri"/>
+          <w:b/>
           <w:sz w:val="22"/>
           <w:szCs w:val="22"/>
           <w:lang w:val="es-ES"/>
@@ -622,10 +629,8 @@
         <w:t>{periodo}</w:t>
       </w:r>
     </w:p>
-    <w:p>
-      <w:bookmarkStart w:id="0" w:name="_GoBack"/>
-      <w:bookmarkEnd w:id="0"/>
-    </w:p>
+    <w:bookmarkEnd w:id="0"/>
+    <w:p/>
     <w:p>
       <w:pPr>
         <w:spacing w:after="0"/>
@@ -747,7 +752,7 @@
               </wp:inline>
             </w:drawing>
           </mc:Choice>
-          <mc:Fallback xmlns:cx2="http://schemas.microsoft.com/office/drawing/2015/10/21/chartex" xmlns:cx3="http://schemas.microsoft.com/office/drawing/2016/5/9/chartex" xmlns:cx4="http://schemas.microsoft.com/office/drawing/2016/5/10/chartex" xmlns:cx5="http://schemas.microsoft.com/office/drawing/2016/5/11/chartex" xmlns:cx6="http://schemas.microsoft.com/office/drawing/2016/5/12/chartex" xmlns:cx7="http://schemas.microsoft.com/office/drawing/2016/5/13/chartex" xmlns:cx8="http://schemas.microsoft.com/office/drawing/2016/5/14/chartex" xmlns:aink="http://schemas.microsoft.com/office/drawing/2016/ink" xmlns:am3d="http://schemas.microsoft.com/office/drawing/2017/model3d" xmlns:oel="http://schemas.microsoft.com/office/2019/extlst" xmlns:w16cex="http://schemas.microsoft.com/office/word/2018/wordml/cex" xmlns:w16cid="http://schemas.microsoft.com/office/word/2016/wordml/cid" xmlns:w16="http://schemas.microsoft.com/office/word/2018/wordml" xmlns:w16sdtdh="http://schemas.microsoft.com/office/word/2020/wordml/sdtdatahash">
+          <mc:Fallback xmlns:w16sdtdh="http://schemas.microsoft.com/office/word/2020/wordml/sdtdatahash" xmlns:w16="http://schemas.microsoft.com/office/word/2018/wordml" xmlns:w16cid="http://schemas.microsoft.com/office/word/2016/wordml/cid" xmlns:w16cex="http://schemas.microsoft.com/office/word/2018/wordml/cex" xmlns:oel="http://schemas.microsoft.com/office/2019/extlst" xmlns:am3d="http://schemas.microsoft.com/office/drawing/2017/model3d" xmlns:aink="http://schemas.microsoft.com/office/drawing/2016/ink" xmlns:cx8="http://schemas.microsoft.com/office/drawing/2016/5/14/chartex" xmlns:cx7="http://schemas.microsoft.com/office/drawing/2016/5/13/chartex" xmlns:cx6="http://schemas.microsoft.com/office/drawing/2016/5/12/chartex" xmlns:cx5="http://schemas.microsoft.com/office/drawing/2016/5/11/chartex" xmlns:cx4="http://schemas.microsoft.com/office/drawing/2016/5/10/chartex" xmlns:cx3="http://schemas.microsoft.com/office/drawing/2016/5/9/chartex" xmlns:cx2="http://schemas.microsoft.com/office/drawing/2015/10/21/chartex">
             <w:pict>
               <v:line w14:anchorId="6ACB160D" id="Conector recto 1" o:spid="_x0000_s1026" style="visibility:visible;mso-wrap-style:square;mso-left-percent:-10001;mso-top-percent:-10001;mso-position-horizontal:absolute;mso-position-horizontal-relative:char;mso-position-vertical:absolute;mso-position-vertical-relative:line;mso-left-percent:-10001;mso-top-percent:-10001" from="0,0" to="235.25pt,0" o:gfxdata="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" strokecolor="#adadad [2414]" strokeweight="1.5pt">
                 <v:stroke joinstyle="miter"/>
@@ -1007,7 +1012,7 @@
               </wp:inline>
             </w:drawing>
           </mc:Choice>
-          <mc:Fallback xmlns:cx2="http://schemas.microsoft.com/office/drawing/2015/10/21/chartex" xmlns:cx3="http://schemas.microsoft.com/office/drawing/2016/5/9/chartex" xmlns:cx4="http://schemas.microsoft.com/office/drawing/2016/5/10/chartex" xmlns:cx5="http://schemas.microsoft.com/office/drawing/2016/5/11/chartex" xmlns:cx6="http://schemas.microsoft.com/office/drawing/2016/5/12/chartex" xmlns:cx7="http://schemas.microsoft.com/office/drawing/2016/5/13/chartex" xmlns:cx8="http://schemas.microsoft.com/office/drawing/2016/5/14/chartex" xmlns:aink="http://schemas.microsoft.com/office/drawing/2016/ink" xmlns:am3d="http://schemas.microsoft.com/office/drawing/2017/model3d" xmlns:oel="http://schemas.microsoft.com/office/2019/extlst" xmlns:w16cex="http://schemas.microsoft.com/office/word/2018/wordml/cex" xmlns:w16cid="http://schemas.microsoft.com/office/word/2016/wordml/cid" xmlns:w16="http://schemas.microsoft.com/office/word/2018/wordml" xmlns:w16sdtdh="http://schemas.microsoft.com/office/word/2020/wordml/sdtdatahash">
+          <mc:Fallback xmlns:w16sdtdh="http://schemas.microsoft.com/office/word/2020/wordml/sdtdatahash" xmlns:w16="http://schemas.microsoft.com/office/word/2018/wordml" xmlns:w16cid="http://schemas.microsoft.com/office/word/2016/wordml/cid" xmlns:w16cex="http://schemas.microsoft.com/office/word/2018/wordml/cex" xmlns:oel="http://schemas.microsoft.com/office/2019/extlst" xmlns:am3d="http://schemas.microsoft.com/office/drawing/2017/model3d" xmlns:aink="http://schemas.microsoft.com/office/drawing/2016/ink" xmlns:cx8="http://schemas.microsoft.com/office/drawing/2016/5/14/chartex" xmlns:cx7="http://schemas.microsoft.com/office/drawing/2016/5/13/chartex" xmlns:cx6="http://schemas.microsoft.com/office/drawing/2016/5/12/chartex" xmlns:cx5="http://schemas.microsoft.com/office/drawing/2016/5/11/chartex" xmlns:cx4="http://schemas.microsoft.com/office/drawing/2016/5/10/chartex" xmlns:cx3="http://schemas.microsoft.com/office/drawing/2016/5/9/chartex" xmlns:cx2="http://schemas.microsoft.com/office/drawing/2015/10/21/chartex">
             <w:pict>
               <v:line w14:anchorId="06D2E983" id="Conector recto 2" o:spid="_x0000_s1026" style="visibility:visible;mso-wrap-style:square;mso-left-percent:-10001;mso-top-percent:-10001;mso-position-horizontal:absolute;mso-position-horizontal-relative:char;mso-position-vertical:absolute;mso-position-vertical-relative:line;mso-left-percent:-10001;mso-top-percent:-10001" from="0,0" to="235.25pt,0" o:gfxdata="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" strokecolor="#adadad [2414]" strokeweight="1.5pt">
                 <v:stroke joinstyle="miter"/>
@@ -1365,7 +1370,7 @@
               </wp:inline>
             </w:drawing>
           </mc:Choice>
-          <mc:Fallback xmlns:cx2="http://schemas.microsoft.com/office/drawing/2015/10/21/chartex" xmlns:cx3="http://schemas.microsoft.com/office/drawing/2016/5/9/chartex" xmlns:cx4="http://schemas.microsoft.com/office/drawing/2016/5/10/chartex" xmlns:cx5="http://schemas.microsoft.com/office/drawing/2016/5/11/chartex" xmlns:cx6="http://schemas.microsoft.com/office/drawing/2016/5/12/chartex" xmlns:cx7="http://schemas.microsoft.com/office/drawing/2016/5/13/chartex" xmlns:cx8="http://schemas.microsoft.com/office/drawing/2016/5/14/chartex" xmlns:aink="http://schemas.microsoft.com/office/drawing/2016/ink" xmlns:am3d="http://schemas.microsoft.com/office/drawing/2017/model3d" xmlns:oel="http://schemas.microsoft.com/office/2019/extlst" xmlns:w16cex="http://schemas.microsoft.com/office/word/2018/wordml/cex" xmlns:w16cid="http://schemas.microsoft.com/office/word/2016/wordml/cid" xmlns:w16="http://schemas.microsoft.com/office/word/2018/wordml" xmlns:w16sdtdh="http://schemas.microsoft.com/office/word/2020/wordml/sdtdatahash">
+          <mc:Fallback xmlns:w16sdtdh="http://schemas.microsoft.com/office/word/2020/wordml/sdtdatahash" xmlns:w16="http://schemas.microsoft.com/office/word/2018/wordml" xmlns:w16cid="http://schemas.microsoft.com/office/word/2016/wordml/cid" xmlns:w16cex="http://schemas.microsoft.com/office/word/2018/wordml/cex" xmlns:oel="http://schemas.microsoft.com/office/2019/extlst" xmlns:am3d="http://schemas.microsoft.com/office/drawing/2017/model3d" xmlns:aink="http://schemas.microsoft.com/office/drawing/2016/ink" xmlns:cx8="http://schemas.microsoft.com/office/drawing/2016/5/14/chartex" xmlns:cx7="http://schemas.microsoft.com/office/drawing/2016/5/13/chartex" xmlns:cx6="http://schemas.microsoft.com/office/drawing/2016/5/12/chartex" xmlns:cx5="http://schemas.microsoft.com/office/drawing/2016/5/11/chartex" xmlns:cx4="http://schemas.microsoft.com/office/drawing/2016/5/10/chartex" xmlns:cx3="http://schemas.microsoft.com/office/drawing/2016/5/9/chartex" xmlns:cx2="http://schemas.microsoft.com/office/drawing/2015/10/21/chartex">
             <w:pict>
               <v:line w14:anchorId="5567C60D" id="Conector recto 3" o:spid="_x0000_s1026" style="visibility:visible;mso-wrap-style:square;mso-left-percent:-10001;mso-top-percent:-10001;mso-position-horizontal:absolute;mso-position-horizontal-relative:char;mso-position-vertical:absolute;mso-position-vertical-relative:line;mso-left-percent:-10001;mso-top-percent:-10001" from="0,0" to="235.25pt,0" o:gfxdata="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" strokecolor="#adadad [2414]" strokeweight="1.5pt">
                 <v:stroke joinstyle="miter"/>
@@ -1591,7 +1596,7 @@
               </wp:inline>
             </w:drawing>
           </mc:Choice>
-          <mc:Fallback xmlns:cx2="http://schemas.microsoft.com/office/drawing/2015/10/21/chartex" xmlns:cx3="http://schemas.microsoft.com/office/drawing/2016/5/9/chartex" xmlns:cx4="http://schemas.microsoft.com/office/drawing/2016/5/10/chartex" xmlns:cx5="http://schemas.microsoft.com/office/drawing/2016/5/11/chartex" xmlns:cx6="http://schemas.microsoft.com/office/drawing/2016/5/12/chartex" xmlns:cx7="http://schemas.microsoft.com/office/drawing/2016/5/13/chartex" xmlns:cx8="http://schemas.microsoft.com/office/drawing/2016/5/14/chartex" xmlns:aink="http://schemas.microsoft.com/office/drawing/2016/ink" xmlns:am3d="http://schemas.microsoft.com/office/drawing/2017/model3d" xmlns:oel="http://schemas.microsoft.com/office/2019/extlst" xmlns:w16cex="http://schemas.microsoft.com/office/word/2018/wordml/cex" xmlns:w16cid="http://schemas.microsoft.com/office/word/2016/wordml/cid" xmlns:w16="http://schemas.microsoft.com/office/word/2018/wordml" xmlns:w16sdtdh="http://schemas.microsoft.com/office/word/2020/wordml/sdtdatahash">
+          <mc:Fallback xmlns:w16sdtdh="http://schemas.microsoft.com/office/word/2020/wordml/sdtdatahash" xmlns:w16="http://schemas.microsoft.com/office/word/2018/wordml" xmlns:w16cid="http://schemas.microsoft.com/office/word/2016/wordml/cid" xmlns:w16cex="http://schemas.microsoft.com/office/word/2018/wordml/cex" xmlns:oel="http://schemas.microsoft.com/office/2019/extlst" xmlns:am3d="http://schemas.microsoft.com/office/drawing/2017/model3d" xmlns:aink="http://schemas.microsoft.com/office/drawing/2016/ink" xmlns:cx8="http://schemas.microsoft.com/office/drawing/2016/5/14/chartex" xmlns:cx7="http://schemas.microsoft.com/office/drawing/2016/5/13/chartex" xmlns:cx6="http://schemas.microsoft.com/office/drawing/2016/5/12/chartex" xmlns:cx5="http://schemas.microsoft.com/office/drawing/2016/5/11/chartex" xmlns:cx4="http://schemas.microsoft.com/office/drawing/2016/5/10/chartex" xmlns:cx3="http://schemas.microsoft.com/office/drawing/2016/5/9/chartex" xmlns:cx2="http://schemas.microsoft.com/office/drawing/2015/10/21/chartex">
             <w:pict>
               <v:line w14:anchorId="4971A7A1" id="Conector recto 4" o:spid="_x0000_s1026" style="visibility:visible;mso-wrap-style:square;mso-left-percent:-10001;mso-top-percent:-10001;mso-position-horizontal:absolute;mso-position-horizontal-relative:char;mso-position-vertical:absolute;mso-position-vertical-relative:line;mso-left-percent:-10001;mso-top-percent:-10001" from="0,0" to="235.25pt,0" o:gfxdata="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" strokecolor="#adadad [2414]" strokeweight="1.5pt">
                 <v:stroke joinstyle="miter"/>

</xml_diff>